<commit_message>
Grey terms line, taller charts, team names, fuller guide
Header is now the question plus two light-grey lines with the terms
needed to read the charts; the freed space makes every chart taller.
Adds Team Jupyter and member names, extends the presenting guide
(hand-in rules, background, the URA unit cap in detail, statistics in
plain words, key numbers, spoken lines) and the Poster_Jupyter.zip
submission file.

Co-Authored-By: Claude Opus 5.5 <noreply@anthropic.com>
</commit_message>
<xml_diff>
--- a/shrinkflation_poster_guide.docx
+++ b/shrinkflation_poster_guide.docx
@@ -48,7 +48,83 @@
         <w:pStyle w:val="Heading1"/>
       </w:pPr>
       <w:r>
-        <w:t>2. How the poster is built</w:t>
+        <w:t>2. What we hand in</w:t>
+      </w:r>
+    </w:p>
+    <w:p>
+      <w:pPr>
+        <w:pStyle w:val="ListBullet"/>
+      </w:pPr>
+      <w:r>
+        <w:rPr>
+          <w:b/>
+        </w:rPr>
+        <w:t>Deadline:</w:t>
+      </w:r>
+      <w:r>
+        <w:rPr>
+          <w:b w:val="0"/>
+        </w:rPr>
+        <w:t xml:space="preserve"> Friday 16 October 2026, 23:59. Up to 24 hours late costs 20%. Later than that counts as no submission.</w:t>
+      </w:r>
+    </w:p>
+    <w:p>
+      <w:pPr>
+        <w:pStyle w:val="ListBullet"/>
+      </w:pPr>
+      <w:r>
+        <w:rPr>
+          <w:b/>
+        </w:rPr>
+        <w:t>One zip file</w:t>
+      </w:r>
+      <w:r>
+        <w:rPr>
+          <w:b w:val="0"/>
+        </w:rPr>
+        <w:t xml:space="preserve"> named Poster_Jupyter, holding the single-sided A4 poster as a PDF and the code. The course outline asks for the code as HTML and the Canvas brief asks for IPYNB, so we hand in both: shrinkflation.ipynb and shrinkflation.html.</w:t>
+      </w:r>
+    </w:p>
+    <w:p>
+      <w:pPr>
+        <w:pStyle w:val="ListBullet"/>
+      </w:pPr>
+      <w:r>
+        <w:rPr>
+          <w:b/>
+        </w:rPr>
+        <w:t>How it is graded:</w:t>
+      </w:r>
+      <w:r>
+        <w:rPr>
+          <w:b w:val="0"/>
+        </w:rPr>
+        <w:t xml:space="preserve"> mainly on the quality of the charts (the right chart for the data, following plotting conventions) and on the insights the charts and comments give. The poster should carry short comments with the key findings or recommendations.</w:t>
+      </w:r>
+    </w:p>
+    <w:p>
+      <w:pPr>
+        <w:pStyle w:val="ListBullet"/>
+      </w:pPr>
+      <w:r>
+        <w:rPr>
+          <w:b/>
+        </w:rPr>
+        <w:t>Team Jupyter:</w:t>
+      </w:r>
+      <w:r>
+        <w:rPr>
+          <w:b w:val="0"/>
+        </w:rPr>
+        <w:t xml:space="preserve"> Martin, Huaitao (Aizen) Yu, Manan, Linda, Midhvan Agarwal and Hoyoung Hwang. Before submitting, check everyone's name is spelled the way they want it on the poster, export the PDF from PowerPoint and check it is one page.</w:t>
+      </w:r>
+    </w:p>
+    <w:p>
+      <w:pPr>
+        <w:pStyle w:val="Heading1"/>
+      </w:pPr>
+      <w:r>
+        <w:t>3. How the poster is built</w:t>
       </w:r>
     </w:p>
     <w:p>
@@ -65,7 +141,7 @@
         <w:rPr>
           <w:b w:val="0"/>
         </w:rPr>
-        <w:t xml:space="preserve"> the question, and six key terms you need to read the charts.</w:t>
+        <w:t xml:space="preserve"> the question, with one grey line underneath holding the few terms you need to read the charts. The key terms table below explains them in full.</w:t>
       </w:r>
     </w:p>
     <w:p>
@@ -149,7 +225,7 @@
         <w:pStyle w:val="Heading1"/>
       </w:pPr>
       <w:r>
-        <w:t>3. Key terms</w:t>
+        <w:t>4. Key terms</w:t>
       </w:r>
     </w:p>
     <w:tbl>
@@ -758,7 +834,728 @@
         <w:pStyle w:val="Heading1"/>
       </w:pPr>
       <w:r>
-        <w:t>4. Data and cleaning</w:t>
+        <w:t>5. Background in two minutes</w:t>
+      </w:r>
+    </w:p>
+    <w:p>
+      <w:pPr>
+        <w:pStyle w:val="ListBullet"/>
+      </w:pPr>
+      <w:r>
+        <w:rPr>
+          <w:b w:val="0"/>
+        </w:rPr>
+        <w:t>Most Singaporeans live in public HDB flats. Our data covers only the private market: condominiums and apartments sold by developers and resold between owners.</w:t>
+      </w:r>
+    </w:p>
+    <w:p>
+      <w:pPr>
+        <w:pStyle w:val="ListBullet"/>
+      </w:pPr>
+      <w:r>
+        <w:rPr>
+          <w:b w:val="0"/>
+        </w:rPr>
+        <w:t>Much of the land for private homes is sold by the government through land tenders (the Government Land Sales programme). A developer who wins a site gets a 99-year lease, plans the units, then launches them for sale, usually before the building is finished.</w:t>
+      </w:r>
+    </w:p>
+    <w:p>
+      <w:pPr>
+        <w:pStyle w:val="ListBullet"/>
+      </w:pPr>
+      <w:r>
+        <w:rPr>
+          <w:b w:val="0"/>
+        </w:rPr>
+        <w:t>Two agencies set the rules that matter here. URA (Urban Redevelopment Authority) plans land use and publishes the transaction data and the price index. MAS (Monetary Authority of Singapore) sets the lending rules that cap how much a buyer can borrow.</w:t>
+      </w:r>
+    </w:p>
+    <w:p>
+      <w:pPr>
+        <w:pStyle w:val="ListBullet"/>
+      </w:pPr>
+      <w:r>
+        <w:rPr>
+          <w:b w:val="0"/>
+        </w:rPr>
+        <w:t>Singapore quotes property prices per square foot (PSF), and floor areas in square feet. 1 m² is about 10.76 sq ft, so 85 m² is about 915 sq ft.</w:t>
+      </w:r>
+    </w:p>
+    <w:p>
+      <w:pPr>
+        <w:pStyle w:val="Heading1"/>
+      </w:pPr>
+      <w:r>
+        <w:t>6. The URA unit cap in detail</w:t>
+      </w:r>
+    </w:p>
+    <w:p>
+      <w:r>
+        <w:rPr>
+          <w:b w:val="0"/>
+        </w:rPr>
+        <w:t>A unit is one home in a building: one apartment or condo flat. A tower with 300 apartments has 300 units. The cap does not limit how small a single unit can be. It limits how many units a project may have:</w:t>
+      </w:r>
+    </w:p>
+    <w:p>
+      <w:r>
+        <w:rPr>
+          <w:b/>
+        </w:rPr>
+        <w:t>Maximum number of units = total floor area of the project ÷ 85 m²</w:t>
+      </w:r>
+      <w:r>
+        <w:rPr>
+          <w:b w:val="0"/>
+        </w:rPr>
+        <w:t xml:space="preserve"> (70 m² from 2012 to 2018)</w:t>
+      </w:r>
+    </w:p>
+    <w:p>
+      <w:pPr>
+        <w:pStyle w:val="ListBullet"/>
+      </w:pPr>
+      <w:r>
+        <w:rPr>
+          <w:b/>
+        </w:rPr>
+        <w:t>Worked example:</w:t>
+      </w:r>
+      <w:r>
+        <w:rPr>
+          <w:b w:val="0"/>
+        </w:rPr>
+        <w:t xml:space="preserve"> a site allowed 17,000 m² of floor area may have at most 17,000 ÷ 85 = 200 units. Squeezing in 400 shoeboxes is no longer allowed, so the homes have to average about 85 m² of floor area each.</w:t>
+      </w:r>
+    </w:p>
+    <w:p>
+      <w:pPr>
+        <w:pStyle w:val="ListBullet"/>
+      </w:pPr>
+      <w:r>
+        <w:rPr>
+          <w:b/>
+        </w:rPr>
+        <w:t>It is a floor on the average, not a fixed size.</w:t>
+      </w:r>
+      <w:r>
+        <w:rPr>
+          <w:b w:val="0"/>
+        </w:rPr>
+        <w:t xml:space="preserve"> A developer can still build some small units if other units are big, and can always choose fewer, bigger units.</w:t>
+      </w:r>
+    </w:p>
+    <w:p>
+      <w:pPr>
+        <w:pStyle w:val="ListBullet"/>
+      </w:pPr>
+      <w:r>
+        <w:rPr>
+          <w:b/>
+        </w:rPr>
+        <w:t>Floor area here is gross floor area</w:t>
+      </w:r>
+      <w:r>
+        <w:rPr>
+          <w:b w:val="0"/>
+        </w:rPr>
+        <w:t>, which includes a share of space such as corridors. The flat a buyer gets is smaller than its share of gross floor area, which is why the post-2019 medians on the poster sit around 760 to 860 sq ft and not at 915.</w:t>
+      </w:r>
+    </w:p>
+    <w:p>
+      <w:pPr>
+        <w:pStyle w:val="ListBullet"/>
+      </w:pPr>
+      <w:r>
+        <w:rPr>
+          <w:b/>
+        </w:rPr>
+        <w:t>Where it applies:</w:t>
+      </w:r>
+      <w:r>
+        <w:rPr>
+          <w:b w:val="0"/>
+        </w:rPr>
+        <w:t xml:space="preserve"> projects outside the Central Area. In nine neighbourhoods (Marine Parade, Joo Chiat-Mountbatten, Telok Kurau-Jalan Eunos, Balestier, Stevens-Chancery, Pasir Panjang, Kovan-How Sun, Shelford and Loyang) the divisor is 100 m² [8]. Since January 2023 the Central Area has its own rule: at least 20% of units in a project must be 70 m² or larger [7].</w:t>
+      </w:r>
+    </w:p>
+    <w:p>
+      <w:pPr>
+        <w:pStyle w:val="ListBullet"/>
+      </w:pPr>
+      <w:r>
+        <w:rPr>
+          <w:b/>
+        </w:rPr>
+        <w:t>Timeline:</w:t>
+      </w:r>
+      <w:r>
+        <w:rPr>
+          <w:b w:val="0"/>
+        </w:rPr>
+        <w:t xml:space="preserve"> 70 m² from January 2012 (announced in 2011), raised to 85 m² from 17 January 2019 (announced 17 October 2018) [5]. Before 2012 there was no cap, which is when shoeboxes spread.</w:t>
+      </w:r>
+    </w:p>
+    <w:p>
+      <w:pPr>
+        <w:pStyle w:val="ListBullet"/>
+      </w:pPr>
+      <w:r>
+        <w:rPr>
+          <w:b/>
+        </w:rPr>
+        <w:t>Why URA did it:</w:t>
+      </w:r>
+      <w:r>
+        <w:rPr>
+          <w:b w:val="0"/>
+        </w:rPr>
+        <w:t xml:space="preserve"> to curb the spread of shoebox units and to stop new projects from straining local roads, schools and transport with more households than an area was planned for [8].</w:t>
+      </w:r>
+    </w:p>
+    <w:p>
+      <w:pPr>
+        <w:pStyle w:val="ListBullet"/>
+      </w:pPr>
+      <w:r>
+        <w:rPr>
+          <w:b/>
+        </w:rPr>
+        <w:t>How it shows on the poster:</w:t>
+      </w:r>
+      <w:r>
+        <w:rPr>
+          <w:b w:val="0"/>
+        </w:rPr>
+        <w:t xml:space="preserve"> the vertical lines in chart 2, shoeboxes falling from 13% to 9% in chart 3, homes on post-2019 land being 7% larger in chart 5, and floor area adding +7% to the price tag in chart 9.</w:t>
+      </w:r>
+    </w:p>
+    <w:p>
+      <w:pPr>
+        <w:pStyle w:val="ListBullet"/>
+      </w:pPr>
+      <w:r>
+        <w:rPr>
+          <w:b/>
+        </w:rPr>
+        <w:t>What we cannot claim:</w:t>
+      </w:r>
+      <w:r>
+        <w:rPr>
+          <w:b w:val="0"/>
+        </w:rPr>
+        <w:t xml:space="preserve"> that the cap caused the shrink to stop. The timing fits, but no chart isolates the cap from everything else that happened in those years.</w:t>
+      </w:r>
+    </w:p>
+    <w:p>
+      <w:pPr>
+        <w:pStyle w:val="Heading1"/>
+      </w:pPr>
+      <w:r>
+        <w:t>7. Reading the statistics</w:t>
+      </w:r>
+    </w:p>
+    <w:tbl>
+      <w:tblPr>
+        <w:tblStyle w:val="TableGrid"/>
+        <w:tblW w:type="auto" w:w="0"/>
+        <w:jc w:val="center"/>
+        <w:tblLayout w:type="fixed"/>
+        <w:tblLook w:firstColumn="1" w:firstRow="1" w:lastColumn="0" w:lastRow="0" w:noHBand="0" w:noVBand="1" w:val="04A0"/>
+      </w:tblPr>
+      <w:tblGrid>
+        <w:gridCol w:w="2268"/>
+        <w:gridCol w:w="6009"/>
+        <w:gridCol w:w="1134"/>
+      </w:tblGrid>
+      <w:tr>
+        <w:tc>
+          <w:tcPr>
+            <w:tcW w:type="dxa" w:w="2268"/>
+            <w:shd w:val="clear" w:color="auto" w:fill="E3ECF8"/>
+          </w:tcPr>
+          <w:p>
+            <w:pPr>
+              <w:spacing w:after="20" w:line="252" w:lineRule="auto"/>
+            </w:pPr>
+            <w:r>
+              <w:rPr>
+                <w:b/>
+                <w:sz w:val="18"/>
+              </w:rPr>
+              <w:t>Term</w:t>
+            </w:r>
+          </w:p>
+        </w:tc>
+        <w:tc>
+          <w:tcPr>
+            <w:tcW w:type="dxa" w:w="6009"/>
+            <w:shd w:val="clear" w:color="auto" w:fill="E3ECF8"/>
+          </w:tcPr>
+          <w:p>
+            <w:pPr>
+              <w:spacing w:after="20" w:line="252" w:lineRule="auto"/>
+            </w:pPr>
+            <w:r>
+              <w:rPr>
+                <w:b/>
+                <w:sz w:val="18"/>
+              </w:rPr>
+              <w:t>Plain meaning</w:t>
+            </w:r>
+          </w:p>
+        </w:tc>
+        <w:tc>
+          <w:tcPr>
+            <w:tcW w:type="dxa" w:w="1134"/>
+            <w:shd w:val="clear" w:color="auto" w:fill="E3ECF8"/>
+          </w:tcPr>
+          <w:p>
+            <w:pPr>
+              <w:spacing w:after="20" w:line="252" w:lineRule="auto"/>
+            </w:pPr>
+            <w:r>
+              <w:rPr>
+                <w:b/>
+                <w:sz w:val="18"/>
+              </w:rPr>
+              <w:t>Where</w:t>
+            </w:r>
+          </w:p>
+        </w:tc>
+      </w:tr>
+      <w:tr>
+        <w:tc>
+          <w:tcPr>
+            <w:tcW w:type="dxa" w:w="2268"/>
+          </w:tcPr>
+          <w:p>
+            <w:pPr>
+              <w:spacing w:after="20" w:line="252" w:lineRule="auto"/>
+            </w:pPr>
+            <w:r>
+              <w:rPr>
+                <w:b/>
+                <w:sz w:val="18"/>
+              </w:rPr>
+              <w:t>Median</w:t>
+            </w:r>
+          </w:p>
+        </w:tc>
+        <w:tc>
+          <w:tcPr>
+            <w:tcW w:type="dxa" w:w="6009"/>
+          </w:tcPr>
+          <w:p>
+            <w:pPr>
+              <w:spacing w:after="20" w:line="252" w:lineRule="auto"/>
+            </w:pPr>
+            <w:r>
+              <w:rPr>
+                <w:b w:val="0"/>
+                <w:sz w:val="18"/>
+              </w:rPr>
+              <w:t>The middle value when everything is sorted. Half the homes are smaller, half bigger. Used because a few huge homes would drag an average up.</w:t>
+            </w:r>
+          </w:p>
+        </w:tc>
+        <w:tc>
+          <w:tcPr>
+            <w:tcW w:type="dxa" w:w="1134"/>
+          </w:tcPr>
+          <w:p>
+            <w:pPr>
+              <w:spacing w:after="20" w:line="252" w:lineRule="auto"/>
+            </w:pPr>
+            <w:r>
+              <w:rPr>
+                <w:b w:val="0"/>
+                <w:sz w:val="18"/>
+              </w:rPr>
+              <w:t>All</w:t>
+            </w:r>
+          </w:p>
+        </w:tc>
+      </w:tr>
+      <w:tr>
+        <w:tc>
+          <w:tcPr>
+            <w:tcW w:type="dxa" w:w="2268"/>
+          </w:tcPr>
+          <w:p>
+            <w:pPr>
+              <w:spacing w:after="20" w:line="252" w:lineRule="auto"/>
+            </w:pPr>
+            <w:r>
+              <w:rPr>
+                <w:b/>
+                <w:sz w:val="18"/>
+              </w:rPr>
+              <w:t>Middle 50% (interquartile range)</w:t>
+            </w:r>
+          </w:p>
+        </w:tc>
+        <w:tc>
+          <w:tcPr>
+            <w:tcW w:type="dxa" w:w="6009"/>
+          </w:tcPr>
+          <w:p>
+            <w:pPr>
+              <w:spacing w:after="20" w:line="252" w:lineRule="auto"/>
+            </w:pPr>
+            <w:r>
+              <w:rPr>
+                <w:b w:val="0"/>
+                <w:sz w:val="18"/>
+              </w:rPr>
+              <w:t>The range from the 25th to the 75th percentile: where the middle half of homes sit.</w:t>
+            </w:r>
+          </w:p>
+        </w:tc>
+        <w:tc>
+          <w:tcPr>
+            <w:tcW w:type="dxa" w:w="1134"/>
+          </w:tcPr>
+          <w:p>
+            <w:pPr>
+              <w:spacing w:after="20" w:line="252" w:lineRule="auto"/>
+            </w:pPr>
+            <w:r>
+              <w:rPr>
+                <w:b w:val="0"/>
+                <w:sz w:val="18"/>
+              </w:rPr>
+              <w:t>2, 6</w:t>
+            </w:r>
+          </w:p>
+        </w:tc>
+      </w:tr>
+      <w:tr>
+        <w:tc>
+          <w:tcPr>
+            <w:tcW w:type="dxa" w:w="2268"/>
+          </w:tcPr>
+          <w:p>
+            <w:pPr>
+              <w:spacing w:after="20" w:line="252" w:lineRule="auto"/>
+            </w:pPr>
+            <w:r>
+              <w:rPr>
+                <w:b/>
+                <w:sz w:val="18"/>
+              </w:rPr>
+              <w:t>Log scale</w:t>
+            </w:r>
+          </w:p>
+        </w:tc>
+        <w:tc>
+          <w:tcPr>
+            <w:tcW w:type="dxa" w:w="6009"/>
+          </w:tcPr>
+          <w:p>
+            <w:pPr>
+              <w:spacing w:after="20" w:line="252" w:lineRule="auto"/>
+            </w:pPr>
+            <w:r>
+              <w:rPr>
+                <w:b w:val="0"/>
+                <w:sz w:val="18"/>
+              </w:rPr>
+              <w:t>Each step on the axis multiplies the value instead of adding to it. On log axes, price = floor area × PSF becomes a straight line, which is why the constant-price curves in chart 5 are straight.</w:t>
+            </w:r>
+          </w:p>
+        </w:tc>
+        <w:tc>
+          <w:tcPr>
+            <w:tcW w:type="dxa" w:w="1134"/>
+          </w:tcPr>
+          <w:p>
+            <w:pPr>
+              <w:spacing w:after="20" w:line="252" w:lineRule="auto"/>
+            </w:pPr>
+            <w:r>
+              <w:rPr>
+                <w:b w:val="0"/>
+                <w:sz w:val="18"/>
+              </w:rPr>
+              <w:t>5</w:t>
+            </w:r>
+          </w:p>
+        </w:tc>
+      </w:tr>
+      <w:tr>
+        <w:tc>
+          <w:tcPr>
+            <w:tcW w:type="dxa" w:w="2268"/>
+          </w:tcPr>
+          <w:p>
+            <w:pPr>
+              <w:spacing w:after="20" w:line="252" w:lineRule="auto"/>
+            </w:pPr>
+            <w:r>
+              <w:rPr>
+                <w:b/>
+                <w:sz w:val="18"/>
+              </w:rPr>
+              <w:t>Regression with controls</w:t>
+            </w:r>
+          </w:p>
+        </w:tc>
+        <w:tc>
+          <w:tcPr>
+            <w:tcW w:type="dxa" w:w="6009"/>
+          </w:tcPr>
+          <w:p>
+            <w:pPr>
+              <w:spacing w:after="20" w:line="252" w:lineRule="auto"/>
+            </w:pPr>
+            <w:r>
+              <w:rPr>
+                <w:b w:val="0"/>
+                <w:sz w:val="18"/>
+              </w:rPr>
+              <w:t>A model that compares eras while holding other things fixed, here district, property type and year of sale. It answers: among otherwise similar homes, how much smaller is each era?</w:t>
+            </w:r>
+          </w:p>
+        </w:tc>
+        <w:tc>
+          <w:tcPr>
+            <w:tcW w:type="dxa" w:w="1134"/>
+          </w:tcPr>
+          <w:p>
+            <w:pPr>
+              <w:spacing w:after="20" w:line="252" w:lineRule="auto"/>
+            </w:pPr>
+            <w:r>
+              <w:rPr>
+                <w:b w:val="0"/>
+                <w:sz w:val="18"/>
+              </w:rPr>
+              <w:t>4</w:t>
+            </w:r>
+          </w:p>
+        </w:tc>
+      </w:tr>
+      <w:tr>
+        <w:tc>
+          <w:tcPr>
+            <w:tcW w:type="dxa" w:w="2268"/>
+          </w:tcPr>
+          <w:p>
+            <w:pPr>
+              <w:spacing w:after="20" w:line="252" w:lineRule="auto"/>
+            </w:pPr>
+            <w:r>
+              <w:rPr>
+                <w:b/>
+                <w:sz w:val="18"/>
+              </w:rPr>
+              <w:t>95% confidence interval</w:t>
+            </w:r>
+          </w:p>
+        </w:tc>
+        <w:tc>
+          <w:tcPr>
+            <w:tcW w:type="dxa" w:w="6009"/>
+          </w:tcPr>
+          <w:p>
+            <w:pPr>
+              <w:spacing w:after="20" w:line="252" w:lineRule="auto"/>
+            </w:pPr>
+            <w:r>
+              <w:rPr>
+                <w:b w:val="0"/>
+                <w:sz w:val="18"/>
+              </w:rPr>
+              <w:t>The range the true value very likely sits in, given the data. If the interval does not cross zero, the gap is not a fluke of which homes happened to sell.</w:t>
+            </w:r>
+          </w:p>
+        </w:tc>
+        <w:tc>
+          <w:tcPr>
+            <w:tcW w:type="dxa" w:w="1134"/>
+          </w:tcPr>
+          <w:p>
+            <w:pPr>
+              <w:spacing w:after="20" w:line="252" w:lineRule="auto"/>
+            </w:pPr>
+            <w:r>
+              <w:rPr>
+                <w:b w:val="0"/>
+                <w:sz w:val="18"/>
+              </w:rPr>
+              <w:t>4</w:t>
+            </w:r>
+          </w:p>
+        </w:tc>
+      </w:tr>
+      <w:tr>
+        <w:tc>
+          <w:tcPr>
+            <w:tcW w:type="dxa" w:w="2268"/>
+          </w:tcPr>
+          <w:p>
+            <w:pPr>
+              <w:spacing w:after="20" w:line="252" w:lineRule="auto"/>
+            </w:pPr>
+            <w:r>
+              <w:rPr>
+                <w:b/>
+                <w:sz w:val="18"/>
+              </w:rPr>
+              <w:t>Clustered standard errors</w:t>
+            </w:r>
+          </w:p>
+        </w:tc>
+        <w:tc>
+          <w:tcPr>
+            <w:tcW w:type="dxa" w:w="6009"/>
+          </w:tcPr>
+          <w:p>
+            <w:pPr>
+              <w:spacing w:after="20" w:line="252" w:lineRule="auto"/>
+            </w:pPr>
+            <w:r>
+              <w:rPr>
+                <w:b w:val="0"/>
+                <w:sz w:val="18"/>
+              </w:rPr>
+              <w:t>Units in one project are designed together, so 1,000 sales in one project are not 1,000 independent observations. Clustering by project makes the intervals honest about that.</w:t>
+            </w:r>
+          </w:p>
+        </w:tc>
+        <w:tc>
+          <w:tcPr>
+            <w:tcW w:type="dxa" w:w="1134"/>
+          </w:tcPr>
+          <w:p>
+            <w:pPr>
+              <w:spacing w:after="20" w:line="252" w:lineRule="auto"/>
+            </w:pPr>
+            <w:r>
+              <w:rPr>
+                <w:b w:val="0"/>
+                <w:sz w:val="18"/>
+              </w:rPr>
+              <w:t>4</w:t>
+            </w:r>
+          </w:p>
+        </w:tc>
+      </w:tr>
+      <w:tr>
+        <w:tc>
+          <w:tcPr>
+            <w:tcW w:type="dxa" w:w="2268"/>
+          </w:tcPr>
+          <w:p>
+            <w:pPr>
+              <w:spacing w:after="20" w:line="252" w:lineRule="auto"/>
+            </w:pPr>
+            <w:r>
+              <w:rPr>
+                <w:b/>
+                <w:sz w:val="18"/>
+              </w:rPr>
+              <w:t>Geometric mean</w:t>
+            </w:r>
+          </w:p>
+        </w:tc>
+        <w:tc>
+          <w:tcPr>
+            <w:tcW w:type="dxa" w:w="6009"/>
+          </w:tcPr>
+          <w:p>
+            <w:pPr>
+              <w:spacing w:after="20" w:line="252" w:lineRule="auto"/>
+            </w:pPr>
+            <w:r>
+              <w:rPr>
+                <w:b w:val="0"/>
+                <w:sz w:val="18"/>
+              </w:rPr>
+              <w:t>The average of the logs, turned back into a number. It lets a price change split exactly into a PSF part and a floor-area part.</w:t>
+            </w:r>
+          </w:p>
+        </w:tc>
+        <w:tc>
+          <w:tcPr>
+            <w:tcW w:type="dxa" w:w="1134"/>
+          </w:tcPr>
+          <w:p>
+            <w:pPr>
+              <w:spacing w:after="20" w:line="252" w:lineRule="auto"/>
+            </w:pPr>
+            <w:r>
+              <w:rPr>
+                <w:b w:val="0"/>
+                <w:sz w:val="18"/>
+              </w:rPr>
+              <w:t>9</w:t>
+            </w:r>
+          </w:p>
+        </w:tc>
+      </w:tr>
+      <w:tr>
+        <w:tc>
+          <w:tcPr>
+            <w:tcW w:type="dxa" w:w="2268"/>
+          </w:tcPr>
+          <w:p>
+            <w:pPr>
+              <w:spacing w:after="20" w:line="252" w:lineRule="auto"/>
+            </w:pPr>
+            <w:r>
+              <w:rPr>
+                <w:b/>
+                <w:sz w:val="18"/>
+              </w:rPr>
+              <w:t>Index (2009 = 100)</w:t>
+            </w:r>
+          </w:p>
+        </w:tc>
+        <w:tc>
+          <w:tcPr>
+            <w:tcW w:type="dxa" w:w="6009"/>
+          </w:tcPr>
+          <w:p>
+            <w:pPr>
+              <w:spacing w:after="20" w:line="252" w:lineRule="auto"/>
+            </w:pPr>
+            <w:r>
+              <w:rPr>
+                <w:b w:val="0"/>
+                <w:sz w:val="18"/>
+              </w:rPr>
+              <w:t>A series rescaled so one year equals 100. A value of 200 means double the base year.</w:t>
+            </w:r>
+          </w:p>
+        </w:tc>
+        <w:tc>
+          <w:tcPr>
+            <w:tcW w:type="dxa" w:w="1134"/>
+          </w:tcPr>
+          <w:p>
+            <w:pPr>
+              <w:spacing w:after="20" w:line="252" w:lineRule="auto"/>
+            </w:pPr>
+            <w:r>
+              <w:rPr>
+                <w:b w:val="0"/>
+                <w:sz w:val="18"/>
+              </w:rPr>
+              <w:t>7</w:t>
+            </w:r>
+          </w:p>
+        </w:tc>
+      </w:tr>
+    </w:tbl>
+    <w:p/>
+    <w:p>
+      <w:pPr>
+        <w:pStyle w:val="Heading1"/>
+      </w:pPr>
+      <w:r>
+        <w:t>8. Data and cleaning</w:t>
       </w:r>
     </w:p>
     <w:p>
@@ -868,7 +1665,74 @@
         <w:pStyle w:val="Heading1"/>
       </w:pPr>
       <w:r>
-        <w:t>5. Chart by chart</w:t>
+        <w:t>9. Files and how to rerun</w:t>
+      </w:r>
+    </w:p>
+    <w:p>
+      <w:pPr>
+        <w:pStyle w:val="ListBullet"/>
+      </w:pPr>
+      <w:r>
+        <w:rPr>
+          <w:b/>
+        </w:rPr>
+        <w:t>shrinkflation.ipynb:</w:t>
+      </w:r>
+      <w:r>
+        <w:rPr>
+          <w:b w:val="0"/>
+        </w:rPr>
+        <w:t xml:space="preserve"> the notebook we hand in. It loads and cleans the data, draws all nine charts, prints every number on the poster and ends with the conclusion and references. It runs top to bottom in Colab or Jupyter if the data folder sits next to it, and needs polars, numpy, matplotlib and statsmodels (Colab has all four).</w:t>
+      </w:r>
+    </w:p>
+    <w:p>
+      <w:pPr>
+        <w:pStyle w:val="ListBullet"/>
+      </w:pPr>
+      <w:r>
+        <w:rPr>
+          <w:b/>
+        </w:rPr>
+        <w:t>data/</w:t>
+      </w:r>
+      <w:r>
+        <w:rPr>
+          <w:b w:val="0"/>
+        </w:rPr>
+        <w:t xml:space="preserve"> holds the four CSVs, </w:t>
+      </w:r>
+      <w:r>
+        <w:rPr>
+          <w:b/>
+        </w:rPr>
+        <w:t>figs/</w:t>
+      </w:r>
+      <w:r>
+        <w:rPr>
+          <w:b w:val="0"/>
+        </w:rPr>
+        <w:t xml:space="preserve"> the nine charts at poster size. Edit poster text in </w:t>
+      </w:r>
+      <w:r>
+        <w:rPr>
+          <w:b/>
+        </w:rPr>
+        <w:t>shrinkflation_poster.pptx</w:t>
+      </w:r>
+      <w:r>
+        <w:rPr>
+          <w:b w:val="0"/>
+        </w:rPr>
+        <w:t>; the charts are images, so change them in the notebook and re-insert.</w:t>
+      </w:r>
+    </w:p>
+    <w:p>
+      <w:pPr>
+        <w:pStyle w:val="Heading1"/>
+        <w:pageBreakBefore/>
+      </w:pPr>
+      <w:r>
+        <w:t>10. Chart by chart</w:t>
       </w:r>
     </w:p>
     <w:p>
@@ -882,7 +1746,7 @@
     <w:p>
       <w:pPr>
         <w:pStyle w:val="Heading2"/>
-        <w:pageBreakBefore/>
+        <w:pageBreakBefore w:val="0"/>
       </w:pPr>
       <w:r>
         <w:t>Chart 1: back-to-back histogram</w:t>
@@ -908,7 +1772,7 @@
       <w:r>
         <w:drawing>
           <wp:inline xmlns:a="http://schemas.openxmlformats.org/drawingml/2006/main" xmlns:pic="http://schemas.openxmlformats.org/drawingml/2006/picture">
-            <wp:extent cx="3096000" cy="2558136"/>
+            <wp:extent cx="2844000" cy="2651186"/>
             <wp:docPr id="1" name="Picture 1"/>
             <wp:cNvGraphicFramePr>
               <a:graphicFrameLocks noChangeAspect="1"/>
@@ -929,7 +1793,7 @@
                   <pic:spPr>
                     <a:xfrm>
                       <a:off x="0" y="0"/>
-                      <a:ext cx="3096000" cy="2558136"/>
+                      <a:ext cx="2844000" cy="2651186"/>
                     </a:xfrm>
                     <a:prstGeom prst="rect"/>
                   </pic:spPr>
@@ -1060,6 +1924,10 @@
       </w:r>
     </w:p>
     <w:p>
+      <w:pPr>
+        <w:keepNext/>
+        <w:pageBreakBefore/>
+      </w:pPr>
       <w:r>
         <w:rPr>
           <w:b w:val="0"/>
@@ -1071,7 +1939,7 @@
     <w:p>
       <w:pPr>
         <w:pStyle w:val="Heading2"/>
-        <w:pageBreakBefore/>
+        <w:pageBreakBefore w:val="0"/>
       </w:pPr>
       <w:r>
         <w:t>Chart 2: line with interquartile band</w:t>
@@ -1097,7 +1965,7 @@
       <w:r>
         <w:drawing>
           <wp:inline xmlns:a="http://schemas.openxmlformats.org/drawingml/2006/main" xmlns:pic="http://schemas.openxmlformats.org/drawingml/2006/picture">
-            <wp:extent cx="3096000" cy="2558136"/>
+            <wp:extent cx="2844000" cy="2651186"/>
             <wp:docPr id="2" name="Picture 2"/>
             <wp:cNvGraphicFramePr>
               <a:graphicFrameLocks noChangeAspect="1"/>
@@ -1118,7 +1986,7 @@
                   <pic:spPr>
                     <a:xfrm>
                       <a:off x="0" y="0"/>
-                      <a:ext cx="3096000" cy="2558136"/>
+                      <a:ext cx="2844000" cy="2651186"/>
                     </a:xfrm>
                     <a:prstGeom prst="rect"/>
                   </pic:spPr>
@@ -1260,6 +2128,10 @@
       </w:r>
     </w:p>
     <w:p>
+      <w:pPr>
+        <w:keepNext/>
+        <w:pageBreakBefore/>
+      </w:pPr>
       <w:r>
         <w:rPr>
           <w:b w:val="0"/>
@@ -1271,7 +2143,7 @@
     <w:p>
       <w:pPr>
         <w:pStyle w:val="Heading2"/>
-        <w:pageBreakBefore/>
+        <w:pageBreakBefore w:val="0"/>
       </w:pPr>
       <w:r>
         <w:t>Chart 3: 100% stacked bar</w:t>
@@ -1297,7 +2169,7 @@
       <w:r>
         <w:drawing>
           <wp:inline xmlns:a="http://schemas.openxmlformats.org/drawingml/2006/main" xmlns:pic="http://schemas.openxmlformats.org/drawingml/2006/picture">
-            <wp:extent cx="3096000" cy="2558136"/>
+            <wp:extent cx="2844000" cy="2651186"/>
             <wp:docPr id="3" name="Picture 3"/>
             <wp:cNvGraphicFramePr>
               <a:graphicFrameLocks noChangeAspect="1"/>
@@ -1318,7 +2190,7 @@
                   <pic:spPr>
                     <a:xfrm>
                       <a:off x="0" y="0"/>
-                      <a:ext cx="3096000" cy="2558136"/>
+                      <a:ext cx="2844000" cy="2651186"/>
                     </a:xfrm>
                     <a:prstGeom prst="rect"/>
                   </pic:spPr>
@@ -1982,6 +2854,10 @@
       </w:r>
     </w:p>
     <w:p>
+      <w:pPr>
+        <w:keepNext/>
+        <w:pageBreakBefore/>
+      </w:pPr>
       <w:r>
         <w:rPr>
           <w:b w:val="0"/>
@@ -1993,7 +2869,7 @@
     <w:p>
       <w:pPr>
         <w:pStyle w:val="Heading2"/>
-        <w:pageBreakBefore/>
+        <w:pageBreakBefore w:val="0"/>
       </w:pPr>
       <w:r>
         <w:t>Chart 4: coefficient plot</w:t>
@@ -2019,7 +2895,7 @@
       <w:r>
         <w:drawing>
           <wp:inline xmlns:a="http://schemas.openxmlformats.org/drawingml/2006/main" xmlns:pic="http://schemas.openxmlformats.org/drawingml/2006/picture">
-            <wp:extent cx="3096000" cy="2558136"/>
+            <wp:extent cx="2844000" cy="2651186"/>
             <wp:docPr id="4" name="Picture 4"/>
             <wp:cNvGraphicFramePr>
               <a:graphicFrameLocks noChangeAspect="1"/>
@@ -2040,7 +2916,7 @@
                   <pic:spPr>
                     <a:xfrm>
                       <a:off x="0" y="0"/>
-                      <a:ext cx="3096000" cy="2558136"/>
+                      <a:ext cx="2844000" cy="2651186"/>
                     </a:xfrm>
                     <a:prstGeom prst="rect"/>
                   </pic:spPr>
@@ -2212,6 +3088,10 @@
       </w:r>
     </w:p>
     <w:p>
+      <w:pPr>
+        <w:keepNext/>
+        <w:pageBreakBefore/>
+      </w:pPr>
       <w:r>
         <w:rPr>
           <w:b w:val="0"/>
@@ -2223,7 +3103,7 @@
     <w:p>
       <w:pPr>
         <w:pStyle w:val="Heading2"/>
-        <w:pageBreakBefore/>
+        <w:pageBreakBefore w:val="0"/>
       </w:pPr>
       <w:r>
         <w:t>Chart 5: scatter with constant-price curves</w:t>
@@ -2249,7 +3129,7 @@
       <w:r>
         <w:drawing>
           <wp:inline xmlns:a="http://schemas.openxmlformats.org/drawingml/2006/main" xmlns:pic="http://schemas.openxmlformats.org/drawingml/2006/picture">
-            <wp:extent cx="3096000" cy="2558136"/>
+            <wp:extent cx="2844000" cy="2651186"/>
             <wp:docPr id="5" name="Picture 5"/>
             <wp:cNvGraphicFramePr>
               <a:graphicFrameLocks noChangeAspect="1"/>
@@ -2270,7 +3150,7 @@
                   <pic:spPr>
                     <a:xfrm>
                       <a:off x="0" y="0"/>
-                      <a:ext cx="3096000" cy="2558136"/>
+                      <a:ext cx="2844000" cy="2651186"/>
                     </a:xfrm>
                     <a:prstGeom prst="rect"/>
                   </pic:spPr>
@@ -2390,6 +3270,10 @@
       </w:r>
     </w:p>
     <w:p>
+      <w:pPr>
+        <w:keepNext/>
+        <w:pageBreakBefore/>
+      </w:pPr>
       <w:r>
         <w:rPr>
           <w:b w:val="0"/>
@@ -2401,7 +3285,7 @@
     <w:p>
       <w:pPr>
         <w:pStyle w:val="Heading2"/>
-        <w:pageBreakBefore/>
+        <w:pageBreakBefore w:val="0"/>
       </w:pPr>
       <w:r>
         <w:t>Chart 6: violin</w:t>
@@ -2427,7 +3311,7 @@
       <w:r>
         <w:drawing>
           <wp:inline xmlns:a="http://schemas.openxmlformats.org/drawingml/2006/main" xmlns:pic="http://schemas.openxmlformats.org/drawingml/2006/picture">
-            <wp:extent cx="3096000" cy="2558136"/>
+            <wp:extent cx="2844000" cy="2651186"/>
             <wp:docPr id="6" name="Picture 6"/>
             <wp:cNvGraphicFramePr>
               <a:graphicFrameLocks noChangeAspect="1"/>
@@ -2448,7 +3332,7 @@
                   <pic:spPr>
                     <a:xfrm>
                       <a:off x="0" y="0"/>
-                      <a:ext cx="3096000" cy="2558136"/>
+                      <a:ext cx="2844000" cy="2651186"/>
                     </a:xfrm>
                     <a:prstGeom prst="rect"/>
                   </pic:spPr>
@@ -2584,6 +3468,10 @@
       </w:r>
     </w:p>
     <w:p>
+      <w:pPr>
+        <w:keepNext/>
+        <w:pageBreakBefore/>
+      </w:pPr>
       <w:r>
         <w:rPr>
           <w:b w:val="0"/>
@@ -2595,7 +3483,7 @@
     <w:p>
       <w:pPr>
         <w:pStyle w:val="Heading2"/>
-        <w:pageBreakBefore/>
+        <w:pageBreakBefore w:val="0"/>
       </w:pPr>
       <w:r>
         <w:t>Chart 7: diverging lollipop</w:t>
@@ -2621,7 +3509,7 @@
       <w:r>
         <w:drawing>
           <wp:inline xmlns:a="http://schemas.openxmlformats.org/drawingml/2006/main" xmlns:pic="http://schemas.openxmlformats.org/drawingml/2006/picture">
-            <wp:extent cx="3096000" cy="2558136"/>
+            <wp:extent cx="2844000" cy="2651186"/>
             <wp:docPr id="7" name="Picture 7"/>
             <wp:cNvGraphicFramePr>
               <a:graphicFrameLocks noChangeAspect="1"/>
@@ -2642,7 +3530,7 @@
                   <pic:spPr>
                     <a:xfrm>
                       <a:off x="0" y="0"/>
-                      <a:ext cx="3096000" cy="2558136"/>
+                      <a:ext cx="2844000" cy="2651186"/>
                     </a:xfrm>
                     <a:prstGeom prst="rect"/>
                   </pic:spPr>
@@ -2666,7 +3554,7 @@
         <w:rPr>
           <w:b w:val="0"/>
         </w:rPr>
-        <w:t>How affordable private homes were each year from 2001 to 2025, against the 25-year average. Homes were 13 to 18% less affordable than usual in 2007, 2008, 2010 and 2011, and 6 to 7% in 2012 and 2013; 2009 dipped to average in the financial crisis. From 2014 incomes grew faster than prices, and 2017 was 16% more affordable than usual. 2025 is 2% below average.</w:t>
+        <w:t>How affordable private homes were each year against the 2001–2025 average. 2007 to 2013 were 6 to 18% less affordable than usual, except 2009 (financial crisis). From 2014 incomes grew faster than prices; 2017 was 16% more affordable. 2025 is 2% below average.</w:t>
       </w:r>
     </w:p>
     <w:p>
@@ -2696,7 +3584,7 @@
         <w:rPr>
           <w:b w:val="0"/>
         </w:rPr>
-        <w:t>The grey band marks 2007 to 2013, the years when the land behind the smallest homes in chart 2 was sold.</w:t>
+        <w:t>The grey band marks 2007 to 2013, when the land behind chart 2's smallest homes was sold.</w:t>
       </w:r>
     </w:p>
     <w:p>
@@ -2712,7 +3600,7 @@
         <w:rPr>
           <w:b w:val="0"/>
         </w:rPr>
-        <w:t>A lollipop shows one value per year against a baseline with less ink than 25 bars, and the two colours make the sign readable at a glance. It is the chart that brings in outside data, as the assignment asked, to explain why developers shrank homes at that time.</w:t>
+        <w:t>A lollipop shows one value per year against a baseline with less ink than 25 bars, and the colours show the sign at a glance. It brings in the outside data the assignment asked for, to explain why developers shrank homes then.</w:t>
       </w:r>
     </w:p>
     <w:p>
@@ -2731,7 +3619,7 @@
         <w:rPr>
           <w:b w:val="0"/>
         </w:rPr>
-        <w:t>Price: URA's private residential price index for non-landed homes (condos and apartments), averaged over the four quarters of each year.</w:t>
+        <w:t>Price: URA's non-landed price index (condos and apartments), averaged over each year's four quarters.</w:t>
       </w:r>
     </w:p>
     <w:p>
@@ -2742,7 +3630,7 @@
         <w:rPr>
           <w:b w:val="0"/>
         </w:rPr>
-        <w:t>Income: SingStat's yearly percentage change in median household employment income (resident employed households, including employer CPF), chained into an index with 2000 = 100.</w:t>
+        <w:t>Income: SingStat's yearly change in median household employment income (including employer CPF), chained into an index with 2000 = 100.</w:t>
       </w:r>
     </w:p>
     <w:p>
@@ -2753,7 +3641,7 @@
         <w:rPr>
           <w:b w:val="0"/>
         </w:rPr>
-        <w:t>Ratio = price index ÷ income index, shown as a percentage above or below its 2001–2025 average. From 2009 to 2025 both indices about doubled, which is why 2025 sits close to average.</w:t>
+        <w:t>Ratio = price index ÷ income index, as a percentage above or below its 2001–2025 average. Both indices about doubled from 2009 to 2025, which is why 2025 sits near average.</w:t>
       </w:r>
     </w:p>
     <w:p>
@@ -2769,7 +3657,7 @@
         <w:rPr>
           <w:b w:val="0"/>
         </w:rPr>
-        <w:t>This is a ratio of two indices, not a price-to-income ratio in years of income. It says when homes were more or less affordable than usual, not how many years of income a home costs. It is also an association: other things changed in 2007 to 2013 too, such as interest rates and cooling measures.</w:t>
+        <w:t>This is a ratio of two indices. It says when homes were more or less affordable than usual, not how many years of income a home costs. It is also an association, since interest rates and cooling measures changed in 2007 to 2013 too.</w:t>
       </w:r>
     </w:p>
     <w:p>
@@ -2792,6 +3680,10 @@
       </w:r>
     </w:p>
     <w:p>
+      <w:pPr>
+        <w:keepNext/>
+        <w:pageBreakBefore/>
+      </w:pPr>
       <w:r>
         <w:rPr>
           <w:b w:val="0"/>
@@ -2803,7 +3695,7 @@
     <w:p>
       <w:pPr>
         <w:pStyle w:val="Heading2"/>
-        <w:pageBreakBefore/>
+        <w:pageBreakBefore w:val="0"/>
       </w:pPr>
       <w:r>
         <w:t>Chart 8: sensitivity heat map</w:t>
@@ -2829,7 +3721,7 @@
       <w:r>
         <w:drawing>
           <wp:inline xmlns:a="http://schemas.openxmlformats.org/drawingml/2006/main" xmlns:pic="http://schemas.openxmlformats.org/drawingml/2006/picture">
-            <wp:extent cx="3096000" cy="2558136"/>
+            <wp:extent cx="2844000" cy="2651186"/>
             <wp:docPr id="8" name="Picture 8"/>
             <wp:cNvGraphicFramePr>
               <a:graphicFrameLocks noChangeAspect="1"/>
@@ -2850,7 +3742,7 @@
                   <pic:spPr>
                     <a:xfrm>
                       <a:off x="0" y="0"/>
-                      <a:ext cx="3096000" cy="2558136"/>
+                      <a:ext cx="2844000" cy="2651186"/>
                     </a:xfrm>
                     <a:prstGeom prst="rect"/>
                   </pic:spPr>
@@ -3044,6 +3936,10 @@
       </w:r>
     </w:p>
     <w:p>
+      <w:pPr>
+        <w:keepNext/>
+        <w:pageBreakBefore/>
+      </w:pPr>
       <w:r>
         <w:rPr>
           <w:b w:val="0"/>
@@ -3055,7 +3951,7 @@
     <w:p>
       <w:pPr>
         <w:pStyle w:val="Heading2"/>
-        <w:pageBreakBefore/>
+        <w:pageBreakBefore w:val="0"/>
       </w:pPr>
       <w:r>
         <w:t>Chart 9: waterfall</w:t>
@@ -3081,7 +3977,7 @@
       <w:r>
         <w:drawing>
           <wp:inline xmlns:a="http://schemas.openxmlformats.org/drawingml/2006/main" xmlns:pic="http://schemas.openxmlformats.org/drawingml/2006/picture">
-            <wp:extent cx="3096000" cy="2558136"/>
+            <wp:extent cx="2844000" cy="2651186"/>
             <wp:docPr id="9" name="Picture 9"/>
             <wp:cNvGraphicFramePr>
               <a:graphicFrameLocks noChangeAspect="1"/>
@@ -3102,7 +3998,7 @@
                   <pic:spPr>
                     <a:xfrm>
                       <a:off x="0" y="0"/>
-                      <a:ext cx="3096000" cy="2558136"/>
+                      <a:ext cx="2844000" cy="2651186"/>
                     </a:xfrm>
                     <a:prstGeom prst="rect"/>
                   </pic:spPr>
@@ -3245,7 +4141,7 @@
         <w:pStyle w:val="Heading1"/>
       </w:pPr>
       <w:r>
-        <w:t>6. Design choices across the poster</w:t>
+        <w:t>11. Design choices across the poster</w:t>
       </w:r>
     </w:p>
     <w:p>
@@ -3319,7 +4215,7 @@
         <w:pStyle w:val="Heading1"/>
       </w:pPr>
       <w:r>
-        <w:t>7. Limitations</w:t>
+        <w:t>12. Limitations</w:t>
       </w:r>
     </w:p>
     <w:p>
@@ -3404,7 +4300,722 @@
         <w:pStyle w:val="Heading1"/>
       </w:pPr>
       <w:r>
-        <w:t>8. Questions to expect</w:t>
+        <w:t>13. Key numbers to remember</w:t>
+      </w:r>
+    </w:p>
+    <w:tbl>
+      <w:tblPr>
+        <w:tblStyle w:val="TableGrid"/>
+        <w:tblW w:type="auto" w:w="0"/>
+        <w:jc w:val="center"/>
+        <w:tblLayout w:type="fixed"/>
+        <w:tblLook w:firstColumn="1" w:firstRow="1" w:lastColumn="0" w:lastRow="0" w:noHBand="0" w:noVBand="1" w:val="04A0"/>
+      </w:tblPr>
+      <w:tblGrid>
+        <w:gridCol w:w="2608"/>
+        <w:gridCol w:w="5669"/>
+        <w:gridCol w:w="1134"/>
+      </w:tblGrid>
+      <w:tr>
+        <w:tc>
+          <w:tcPr>
+            <w:tcW w:type="dxa" w:w="2608"/>
+            <w:shd w:val="clear" w:color="auto" w:fill="E3ECF8"/>
+          </w:tcPr>
+          <w:p>
+            <w:pPr>
+              <w:spacing w:after="20" w:line="252" w:lineRule="auto"/>
+            </w:pPr>
+            <w:r>
+              <w:rPr>
+                <w:b/>
+                <w:sz w:val="18"/>
+              </w:rPr>
+              <w:t>Number</w:t>
+            </w:r>
+          </w:p>
+        </w:tc>
+        <w:tc>
+          <w:tcPr>
+            <w:tcW w:type="dxa" w:w="5669"/>
+            <w:shd w:val="clear" w:color="auto" w:fill="E3ECF8"/>
+          </w:tcPr>
+          <w:p>
+            <w:pPr>
+              <w:spacing w:after="20" w:line="252" w:lineRule="auto"/>
+            </w:pPr>
+            <w:r>
+              <w:rPr>
+                <w:b/>
+                <w:sz w:val="18"/>
+              </w:rPr>
+              <w:t>What it is</w:t>
+            </w:r>
+          </w:p>
+        </w:tc>
+        <w:tc>
+          <w:tcPr>
+            <w:tcW w:type="dxa" w:w="1134"/>
+            <w:shd w:val="clear" w:color="auto" w:fill="E3ECF8"/>
+          </w:tcPr>
+          <w:p>
+            <w:pPr>
+              <w:spacing w:after="20" w:line="252" w:lineRule="auto"/>
+            </w:pPr>
+            <w:r>
+              <w:rPr>
+                <w:b/>
+                <w:sz w:val="18"/>
+              </w:rPr>
+              <w:t>Chart</w:t>
+            </w:r>
+          </w:p>
+        </w:tc>
+      </w:tr>
+      <w:tr>
+        <w:tc>
+          <w:tcPr>
+            <w:tcW w:type="dxa" w:w="2608"/>
+          </w:tcPr>
+          <w:p>
+            <w:pPr>
+              <w:spacing w:after="20" w:line="252" w:lineRule="auto"/>
+            </w:pPr>
+            <w:r>
+              <w:rPr>
+                <w:b/>
+                <w:sz w:val="18"/>
+              </w:rPr>
+              <w:t>797 vs 1,012 sq ft</w:t>
+            </w:r>
+          </w:p>
+        </w:tc>
+        <w:tc>
+          <w:tcPr>
+            <w:tcW w:type="dxa" w:w="5669"/>
+          </w:tcPr>
+          <w:p>
+            <w:pPr>
+              <w:spacing w:after="20" w:line="252" w:lineRule="auto"/>
+            </w:pPr>
+            <w:r>
+              <w:rPr>
+                <w:b w:val="0"/>
+                <w:sz w:val="18"/>
+              </w:rPr>
+              <w:t>Median new launch vs median resale home, 2025 (−21%)</w:t>
+            </w:r>
+          </w:p>
+        </w:tc>
+        <w:tc>
+          <w:tcPr>
+            <w:tcW w:type="dxa" w:w="1134"/>
+          </w:tcPr>
+          <w:p>
+            <w:pPr>
+              <w:spacing w:after="20" w:line="252" w:lineRule="auto"/>
+            </w:pPr>
+            <w:r>
+              <w:rPr>
+                <w:b w:val="0"/>
+                <w:sz w:val="18"/>
+              </w:rPr>
+              <w:t>1</w:t>
+            </w:r>
+          </w:p>
+        </w:tc>
+      </w:tr>
+      <w:tr>
+        <w:tc>
+          <w:tcPr>
+            <w:tcW w:type="dxa" w:w="2608"/>
+          </w:tcPr>
+          <w:p>
+            <w:pPr>
+              <w:spacing w:after="20" w:line="252" w:lineRule="auto"/>
+            </w:pPr>
+            <w:r>
+              <w:rPr>
+                <w:b/>
+                <w:sz w:val="18"/>
+              </w:rPr>
+              <w:t>18% vs 34%</w:t>
+            </w:r>
+          </w:p>
+        </w:tc>
+        <w:tc>
+          <w:tcPr>
+            <w:tcW w:type="dxa" w:w="5669"/>
+          </w:tcPr>
+          <w:p>
+            <w:pPr>
+              <w:spacing w:after="20" w:line="252" w:lineRule="auto"/>
+            </w:pPr>
+            <w:r>
+              <w:rPr>
+                <w:b w:val="0"/>
+                <w:sz w:val="18"/>
+              </w:rPr>
+              <w:t>Share of homes of 1,200 sq ft or more, new vs resale</w:t>
+            </w:r>
+          </w:p>
+        </w:tc>
+        <w:tc>
+          <w:tcPr>
+            <w:tcW w:type="dxa" w:w="1134"/>
+          </w:tcPr>
+          <w:p>
+            <w:pPr>
+              <w:spacing w:after="20" w:line="252" w:lineRule="auto"/>
+            </w:pPr>
+            <w:r>
+              <w:rPr>
+                <w:b w:val="0"/>
+                <w:sz w:val="18"/>
+              </w:rPr>
+              <w:t>1</w:t>
+            </w:r>
+          </w:p>
+        </w:tc>
+      </w:tr>
+      <w:tr>
+        <w:tc>
+          <w:tcPr>
+            <w:tcW w:type="dxa" w:w="2608"/>
+          </w:tcPr>
+          <w:p>
+            <w:pPr>
+              <w:spacing w:after="20" w:line="252" w:lineRule="auto"/>
+            </w:pPr>
+            <w:r>
+              <w:rPr>
+                <w:b/>
+                <w:sz w:val="18"/>
+              </w:rPr>
+              <w:t>1,238 → 710 sq ft</w:t>
+            </w:r>
+          </w:p>
+        </w:tc>
+        <w:tc>
+          <w:tcPr>
+            <w:tcW w:type="dxa" w:w="5669"/>
+          </w:tcPr>
+          <w:p>
+            <w:pPr>
+              <w:spacing w:after="20" w:line="252" w:lineRule="auto"/>
+            </w:pPr>
+            <w:r>
+              <w:rPr>
+                <w:b w:val="0"/>
+                <w:sz w:val="18"/>
+              </w:rPr>
+              <w:t>Median size, land sold 2005–08 vs 2013–15 (−43%)</w:t>
+            </w:r>
+          </w:p>
+        </w:tc>
+        <w:tc>
+          <w:tcPr>
+            <w:tcW w:type="dxa" w:w="1134"/>
+          </w:tcPr>
+          <w:p>
+            <w:pPr>
+              <w:spacing w:after="20" w:line="252" w:lineRule="auto"/>
+            </w:pPr>
+            <w:r>
+              <w:rPr>
+                <w:b w:val="0"/>
+                <w:sz w:val="18"/>
+              </w:rPr>
+              <w:t>2</w:t>
+            </w:r>
+          </w:p>
+        </w:tc>
+      </w:tr>
+      <w:tr>
+        <w:tc>
+          <w:tcPr>
+            <w:tcW w:type="dxa" w:w="2608"/>
+          </w:tcPr>
+          <w:p>
+            <w:pPr>
+              <w:spacing w:after="20" w:line="252" w:lineRule="auto"/>
+            </w:pPr>
+            <w:r>
+              <w:rPr>
+                <w:b/>
+                <w:sz w:val="18"/>
+              </w:rPr>
+              <w:t>1% → 13% → 9%</w:t>
+            </w:r>
+          </w:p>
+        </w:tc>
+        <w:tc>
+          <w:tcPr>
+            <w:tcW w:type="dxa" w:w="5669"/>
+          </w:tcPr>
+          <w:p>
+            <w:pPr>
+              <w:spacing w:after="20" w:line="252" w:lineRule="auto"/>
+            </w:pPr>
+            <w:r>
+              <w:rPr>
+                <w:b w:val="0"/>
+                <w:sz w:val="18"/>
+              </w:rPr>
+              <w:t>Shoebox share: pre-2009 land, 2013–18 land, post-2019 land</w:t>
+            </w:r>
+          </w:p>
+        </w:tc>
+        <w:tc>
+          <w:tcPr>
+            <w:tcW w:type="dxa" w:w="1134"/>
+          </w:tcPr>
+          <w:p>
+            <w:pPr>
+              <w:spacing w:after="20" w:line="252" w:lineRule="auto"/>
+            </w:pPr>
+            <w:r>
+              <w:rPr>
+                <w:b w:val="0"/>
+                <w:sz w:val="18"/>
+              </w:rPr>
+              <w:t>3</w:t>
+            </w:r>
+          </w:p>
+        </w:tc>
+      </w:tr>
+      <w:tr>
+        <w:tc>
+          <w:tcPr>
+            <w:tcW w:type="dxa" w:w="2608"/>
+          </w:tcPr>
+          <w:p>
+            <w:pPr>
+              <w:spacing w:after="20" w:line="252" w:lineRule="auto"/>
+            </w:pPr>
+            <w:r>
+              <w:rPr>
+                <w:b/>
+                <w:sz w:val="18"/>
+              </w:rPr>
+              <w:t>34% → 8% → 11%</w:t>
+            </w:r>
+          </w:p>
+        </w:tc>
+        <w:tc>
+          <w:tcPr>
+            <w:tcW w:type="dxa" w:w="5669"/>
+          </w:tcPr>
+          <w:p>
+            <w:pPr>
+              <w:spacing w:after="20" w:line="252" w:lineRule="auto"/>
+            </w:pPr>
+            <w:r>
+              <w:rPr>
+                <w:b w:val="0"/>
+                <w:sz w:val="18"/>
+              </w:rPr>
+              <w:t>Share of homes over 1,300 sq ft, same eras</w:t>
+            </w:r>
+          </w:p>
+        </w:tc>
+        <w:tc>
+          <w:tcPr>
+            <w:tcW w:type="dxa" w:w="1134"/>
+          </w:tcPr>
+          <w:p>
+            <w:pPr>
+              <w:spacing w:after="20" w:line="252" w:lineRule="auto"/>
+            </w:pPr>
+            <w:r>
+              <w:rPr>
+                <w:b w:val="0"/>
+                <w:sz w:val="18"/>
+              </w:rPr>
+              <w:t>3</w:t>
+            </w:r>
+          </w:p>
+        </w:tc>
+      </w:tr>
+      <w:tr>
+        <w:tc>
+          <w:tcPr>
+            <w:tcW w:type="dxa" w:w="2608"/>
+          </w:tcPr>
+          <w:p>
+            <w:pPr>
+              <w:spacing w:after="20" w:line="252" w:lineRule="auto"/>
+            </w:pPr>
+            <w:r>
+              <w:rPr>
+                <w:b/>
+                <w:sz w:val="18"/>
+              </w:rPr>
+              <w:t>−34%</w:t>
+            </w:r>
+          </w:p>
+        </w:tc>
+        <w:tc>
+          <w:tcPr>
+            <w:tcW w:type="dxa" w:w="5669"/>
+          </w:tcPr>
+          <w:p>
+            <w:pPr>
+              <w:spacing w:after="20" w:line="252" w:lineRule="auto"/>
+            </w:pPr>
+            <w:r>
+              <w:rPr>
+                <w:b w:val="0"/>
+                <w:sz w:val="18"/>
+              </w:rPr>
+              <w:t>Size gap for 2013–18 land within the same district, type and sale year</w:t>
+            </w:r>
+          </w:p>
+        </w:tc>
+        <w:tc>
+          <w:tcPr>
+            <w:tcW w:type="dxa" w:w="1134"/>
+          </w:tcPr>
+          <w:p>
+            <w:pPr>
+              <w:spacing w:after="20" w:line="252" w:lineRule="auto"/>
+            </w:pPr>
+            <w:r>
+              <w:rPr>
+                <w:b w:val="0"/>
+                <w:sz w:val="18"/>
+              </w:rPr>
+              <w:t>4</w:t>
+            </w:r>
+          </w:p>
+        </w:tc>
+      </w:tr>
+      <w:tr>
+        <w:tc>
+          <w:tcPr>
+            <w:tcW w:type="dxa" w:w="2608"/>
+          </w:tcPr>
+          <w:p>
+            <w:pPr>
+              <w:spacing w:after="20" w:line="252" w:lineRule="auto"/>
+            </w:pPr>
+            <w:r>
+              <w:rPr>
+                <w:b/>
+                <w:sz w:val="18"/>
+              </w:rPr>
+              <w:t>S$1.72M → S$1.45M → S$2.05M</w:t>
+            </w:r>
+          </w:p>
+        </w:tc>
+        <w:tc>
+          <w:tcPr>
+            <w:tcW w:type="dxa" w:w="5669"/>
+          </w:tcPr>
+          <w:p>
+            <w:pPr>
+              <w:spacing w:after="20" w:line="252" w:lineRule="auto"/>
+            </w:pPr>
+            <w:r>
+              <w:rPr>
+                <w:b w:val="0"/>
+                <w:sz w:val="18"/>
+              </w:rPr>
+              <w:t>Median 2025 price: pre-2009 land, 2013–18 land, post-2019 land</w:t>
+            </w:r>
+          </w:p>
+        </w:tc>
+        <w:tc>
+          <w:tcPr>
+            <w:tcW w:type="dxa" w:w="1134"/>
+          </w:tcPr>
+          <w:p>
+            <w:pPr>
+              <w:spacing w:after="20" w:line="252" w:lineRule="auto"/>
+            </w:pPr>
+            <w:r>
+              <w:rPr>
+                <w:b w:val="0"/>
+                <w:sz w:val="18"/>
+              </w:rPr>
+              <w:t>5</w:t>
+            </w:r>
+          </w:p>
+        </w:tc>
+      </w:tr>
+      <w:tr>
+        <w:tc>
+          <w:tcPr>
+            <w:tcW w:type="dxa" w:w="2608"/>
+          </w:tcPr>
+          <w:p>
+            <w:pPr>
+              <w:spacing w:after="20" w:line="252" w:lineRule="auto"/>
+            </w:pPr>
+            <w:r>
+              <w:rPr>
+                <w:b/>
+                <w:sz w:val="18"/>
+              </w:rPr>
+              <w:t>within 1.5%</w:t>
+            </w:r>
+          </w:p>
+        </w:tc>
+        <w:tc>
+          <w:tcPr>
+            <w:tcW w:type="dxa" w:w="5669"/>
+          </w:tcPr>
+          <w:p>
+            <w:pPr>
+              <w:spacing w:after="20" w:line="252" w:lineRule="auto"/>
+            </w:pPr>
+            <w:r>
+              <w:rPr>
+                <w:b w:val="0"/>
+                <w:sz w:val="18"/>
+              </w:rPr>
+              <w:t>How close every size band's PSF is to its project's PSF</w:t>
+            </w:r>
+          </w:p>
+        </w:tc>
+        <w:tc>
+          <w:tcPr>
+            <w:tcW w:type="dxa" w:w="1134"/>
+          </w:tcPr>
+          <w:p>
+            <w:pPr>
+              <w:spacing w:after="20" w:line="252" w:lineRule="auto"/>
+            </w:pPr>
+            <w:r>
+              <w:rPr>
+                <w:b w:val="0"/>
+                <w:sz w:val="18"/>
+              </w:rPr>
+              <w:t>6</w:t>
+            </w:r>
+          </w:p>
+        </w:tc>
+      </w:tr>
+      <w:tr>
+        <w:tc>
+          <w:tcPr>
+            <w:tcW w:type="dxa" w:w="2608"/>
+          </w:tcPr>
+          <w:p>
+            <w:pPr>
+              <w:spacing w:after="20" w:line="252" w:lineRule="auto"/>
+            </w:pPr>
+            <w:r>
+              <w:rPr>
+                <w:b/>
+                <w:sz w:val="18"/>
+              </w:rPr>
+              <w:t>+6% to +18%</w:t>
+            </w:r>
+          </w:p>
+        </w:tc>
+        <w:tc>
+          <w:tcPr>
+            <w:tcW w:type="dxa" w:w="5669"/>
+          </w:tcPr>
+          <w:p>
+            <w:pPr>
+              <w:spacing w:after="20" w:line="252" w:lineRule="auto"/>
+            </w:pPr>
+            <w:r>
+              <w:rPr>
+                <w:b w:val="0"/>
+                <w:sz w:val="18"/>
+              </w:rPr>
+              <w:t>How much less affordable than usual homes were in 2007–13 (except 2009)</w:t>
+            </w:r>
+          </w:p>
+        </w:tc>
+        <w:tc>
+          <w:tcPr>
+            <w:tcW w:type="dxa" w:w="1134"/>
+          </w:tcPr>
+          <w:p>
+            <w:pPr>
+              <w:spacing w:after="20" w:line="252" w:lineRule="auto"/>
+            </w:pPr>
+            <w:r>
+              <w:rPr>
+                <w:b w:val="0"/>
+                <w:sz w:val="18"/>
+              </w:rPr>
+              <w:t>7</w:t>
+            </w:r>
+          </w:p>
+        </w:tc>
+      </w:tr>
+      <w:tr>
+        <w:tc>
+          <w:tcPr>
+            <w:tcW w:type="dxa" w:w="2608"/>
+          </w:tcPr>
+          <w:p>
+            <w:pPr>
+              <w:spacing w:after="20" w:line="252" w:lineRule="auto"/>
+            </w:pPr>
+            <w:r>
+              <w:rPr>
+                <w:b/>
+                <w:sz w:val="18"/>
+              </w:rPr>
+              <w:t>S$12,446 → S$1.91M → 743 sq ft</w:t>
+            </w:r>
+          </w:p>
+        </w:tc>
+        <w:tc>
+          <w:tcPr>
+            <w:tcW w:type="dxa" w:w="5669"/>
+          </w:tcPr>
+          <w:p>
+            <w:pPr>
+              <w:spacing w:after="20" w:line="252" w:lineRule="auto"/>
+            </w:pPr>
+            <w:r>
+              <w:rPr>
+                <w:b w:val="0"/>
+                <w:sz w:val="18"/>
+              </w:rPr>
+              <w:t>Median income, the price it can borrow for, the floor area at 2025 launch PSF</w:t>
+            </w:r>
+          </w:p>
+        </w:tc>
+        <w:tc>
+          <w:tcPr>
+            <w:tcW w:type="dxa" w:w="1134"/>
+          </w:tcPr>
+          <w:p>
+            <w:pPr>
+              <w:spacing w:after="20" w:line="252" w:lineRule="auto"/>
+            </w:pPr>
+            <w:r>
+              <w:rPr>
+                <w:b w:val="0"/>
+                <w:sz w:val="18"/>
+              </w:rPr>
+              <w:t>8</w:t>
+            </w:r>
+          </w:p>
+        </w:tc>
+      </w:tr>
+      <w:tr>
+        <w:tc>
+          <w:tcPr>
+            <w:tcW w:type="dxa" w:w="2608"/>
+          </w:tcPr>
+          <w:p>
+            <w:pPr>
+              <w:spacing w:after="20" w:line="252" w:lineRule="auto"/>
+            </w:pPr>
+            <w:r>
+              <w:rPr>
+                <w:b/>
+                <w:sz w:val="18"/>
+              </w:rPr>
+              <w:t>+49% (PSF +39%, area +7%)</w:t>
+            </w:r>
+          </w:p>
+        </w:tc>
+        <w:tc>
+          <w:tcPr>
+            <w:tcW w:type="dxa" w:w="5669"/>
+          </w:tcPr>
+          <w:p>
+            <w:pPr>
+              <w:spacing w:after="20" w:line="252" w:lineRule="auto"/>
+            </w:pPr>
+            <w:r>
+              <w:rPr>
+                <w:b w:val="0"/>
+                <w:sz w:val="18"/>
+              </w:rPr>
+              <w:t>Typical new-launch price, late 2020 to 2025</w:t>
+            </w:r>
+          </w:p>
+        </w:tc>
+        <w:tc>
+          <w:tcPr>
+            <w:tcW w:type="dxa" w:w="1134"/>
+          </w:tcPr>
+          <w:p>
+            <w:pPr>
+              <w:spacing w:after="20" w:line="252" w:lineRule="auto"/>
+            </w:pPr>
+            <w:r>
+              <w:rPr>
+                <w:b w:val="0"/>
+                <w:sz w:val="18"/>
+              </w:rPr>
+              <w:t>9</w:t>
+            </w:r>
+          </w:p>
+        </w:tc>
+      </w:tr>
+      <w:tr>
+        <w:tc>
+          <w:tcPr>
+            <w:tcW w:type="dxa" w:w="2608"/>
+          </w:tcPr>
+          <w:p>
+            <w:pPr>
+              <w:spacing w:after="20" w:line="252" w:lineRule="auto"/>
+            </w:pPr>
+            <w:r>
+              <w:rPr>
+                <w:b/>
+                <w:sz w:val="18"/>
+              </w:rPr>
+              <w:t>S$2,572 vs S$1,747</w:t>
+            </w:r>
+          </w:p>
+        </w:tc>
+        <w:tc>
+          <w:tcPr>
+            <w:tcW w:type="dxa" w:w="5669"/>
+          </w:tcPr>
+          <w:p>
+            <w:pPr>
+              <w:spacing w:after="20" w:line="252" w:lineRule="auto"/>
+            </w:pPr>
+            <w:r>
+              <w:rPr>
+                <w:b w:val="0"/>
+                <w:sz w:val="18"/>
+              </w:rPr>
+              <w:t>Median PSF, new launch vs resale, 2025 (resale gives 47% more space per dollar)</w:t>
+            </w:r>
+          </w:p>
+        </w:tc>
+        <w:tc>
+          <w:tcPr>
+            <w:tcW w:type="dxa" w:w="1134"/>
+          </w:tcPr>
+          <w:p>
+            <w:pPr>
+              <w:spacing w:after="20" w:line="252" w:lineRule="auto"/>
+            </w:pPr>
+            <w:r>
+              <w:rPr>
+                <w:b w:val="0"/>
+                <w:sz w:val="18"/>
+              </w:rPr>
+              <w:t>1, answer</w:t>
+            </w:r>
+          </w:p>
+        </w:tc>
+      </w:tr>
+    </w:tbl>
+    <w:p/>
+    <w:p>
+      <w:pPr>
+        <w:pStyle w:val="Heading1"/>
+      </w:pPr>
+      <w:r>
+        <w:t>14. Questions to expect</w:t>
       </w:r>
     </w:p>
     <w:p>
@@ -3496,6 +5107,48 @@
         <w:rPr>
           <w:b/>
         </w:rPr>
+        <w:t>Does the cap set a minimum flat size?</w:t>
+      </w:r>
+      <w:r>
+        <w:rPr>
+          <w:b w:val="0"/>
+        </w:rPr>
+        <w:t xml:space="preserve"> No. It caps how many units a project may have, which sets a floor on the average. Single small units are still allowed.</w:t>
+      </w:r>
+    </w:p>
+    <w:p>
+      <w:r>
+        <w:rPr>
+          <w:b/>
+        </w:rPr>
+        <w:t>Why are post-2019 medians below 85 m²?</w:t>
+      </w:r>
+      <w:r>
+        <w:rPr>
+          <w:b w:val="0"/>
+        </w:rPr>
+        <w:t xml:space="preserve"> The cap counts gross floor area, which includes a share of common space, so the flat itself is smaller. Medians also sit below averages because a few big units pull the average up.</w:t>
+      </w:r>
+    </w:p>
+    <w:p>
+      <w:r>
+        <w:rPr>
+          <w:b/>
+        </w:rPr>
+        <w:t>Did the cap cause the shrink to stop?</w:t>
+      </w:r>
+      <w:r>
+        <w:rPr>
+          <w:b w:val="0"/>
+        </w:rPr>
+        <w:t xml:space="preserve"> The timing fits and the cap was designed to do it, but our charts show timing, not proof.</w:t>
+      </w:r>
+    </w:p>
+    <w:p>
+      <w:r>
+        <w:rPr>
+          <w:b/>
+        </w:rPr>
         <w:t>What would you do with more time?</w:t>
       </w:r>
       <w:r>
@@ -3510,7 +5163,7 @@
         <w:pStyle w:val="Heading1"/>
       </w:pPr>
       <w:r>
-        <w:t>9. Presenting it in about five minutes</w:t>
+        <w:t>15. Presenting it in about five minutes</w:t>
       </w:r>
     </w:p>
     <w:tbl>
@@ -3850,11 +5503,115 @@
     </w:tbl>
     <w:p/>
     <w:p>
+      <w:r>
+        <w:rPr>
+          <w:b w:val="0"/>
+        </w:rPr>
+        <w:t>Lines you can say, one per part:</w:t>
+      </w:r>
+    </w:p>
+    <w:p>
+      <w:pPr>
+        <w:pStyle w:val="ListBullet"/>
+      </w:pPr>
+      <w:r>
+        <w:rPr>
+          <w:b/>
+        </w:rPr>
+        <w:t>Open:</w:t>
+      </w:r>
+      <w:r>
+        <w:rPr>
+          <w:b w:val="0"/>
+        </w:rPr>
+        <w:t xml:space="preserve"> "Shrinkflation is less product for the same price tag. We asked whether Singapore's private homes did that, and whether it is still happening."</w:t>
+      </w:r>
+    </w:p>
+    <w:p>
+      <w:pPr>
+        <w:pStyle w:val="ListBullet"/>
+      </w:pPr>
+      <w:r>
+        <w:rPr>
+          <w:b/>
+        </w:rPr>
+        <w:t>Row 1:</w:t>
+      </w:r>
+      <w:r>
+        <w:rPr>
+          <w:b w:val="0"/>
+        </w:rPr>
+        <w:t xml:space="preserve"> "Today's new launches are 21% smaller than resale homes. The drop came with land sold after 2008, 43% in five years, and the big homes are what disappeared."</w:t>
+      </w:r>
+    </w:p>
+    <w:p>
+      <w:pPr>
+        <w:pStyle w:val="ListBullet"/>
+      </w:pPr>
+      <w:r>
+        <w:rPr>
+          <w:b/>
+        </w:rPr>
+        <w:t>Row 2:</w:t>
+      </w:r>
+      <w:r>
+        <w:rPr>
+          <w:b w:val="0"/>
+        </w:rPr>
+        <w:t xml:space="preserve"> "It is the same inside every district, so it is not location. And because launches are priced per square foot, a smaller home really does mean a lower price tag."</w:t>
+      </w:r>
+    </w:p>
+    <w:p>
+      <w:pPr>
+        <w:pStyle w:val="ListBullet"/>
+      </w:pPr>
+      <w:r>
+        <w:rPr>
+          <w:b/>
+        </w:rPr>
+        <w:t>Row 3:</w:t>
+      </w:r>
+      <w:r>
+        <w:rPr>
+          <w:b w:val="0"/>
+        </w:rPr>
+        <w:t xml:space="preserve"> "It happened when prices were furthest ahead of incomes. Then URA capped it, so now the price tag rises instead: plus 49% since 2020, at the edge of what a median household can borrow."</w:t>
+      </w:r>
+    </w:p>
+    <w:p>
+      <w:pPr>
+        <w:pStyle w:val="ListBullet"/>
+      </w:pPr>
+      <w:r>
+        <w:rPr>
+          <w:b/>
+        </w:rPr>
+        <w:t>Close:</w:t>
+      </w:r>
+      <w:r>
+        <w:rPr>
+          <w:b w:val="0"/>
+        </w:rPr>
+        <w:t xml:space="preserve"> "So yes, homes shrank to stay affordable, until the rules stopped it. For a buyer, compare price per square foot, not the price tag."</w:t>
+      </w:r>
+    </w:p>
+    <w:p>
+      <w:pPr>
+        <w:pStyle w:val="ListBullet"/>
+      </w:pPr>
+      <w:r>
+        <w:rPr>
+          <w:b w:val="0"/>
+        </w:rPr>
+        <w:t>Say each chart's bold takeaway first, then point at the part of the chart it comes from. Do not read the guide out loud.</w:t>
+      </w:r>
+    </w:p>
+    <w:p>
       <w:pPr>
         <w:pStyle w:val="Heading1"/>
       </w:pPr>
       <w:r>
-        <w:t>10. Sources</w:t>
+        <w:t>16. Sources</w:t>
       </w:r>
     </w:p>
     <w:p>
@@ -3918,6 +5675,15 @@
           <w:sz w:val="18"/>
         </w:rPr>
         <w:t>[7] Lee Sze Teck (Huttons), Are home sizes in Singapore shrinking?, EdgeProp, 7 Mar 2025. https://www.edgeprop.sg/property-news/are-home-sizes-singapore-shrinking</w:t>
+      </w:r>
+    </w:p>
+    <w:p>
+      <w:r>
+        <w:rPr>
+          <w:b w:val="0"/>
+          <w:sz w:val="18"/>
+        </w:rPr>
+        <w:t>[8] EdgeProp, URA curbs excessive development of shoebox units, 17 Oct 2018. https://edgeprop.sg/property-news/ura-curbs-excessive-development-shoebox-units</w:t>
       </w:r>
     </w:p>
     <w:sectPr>

</xml_diff>

<commit_message>
First names only; split guide into a short must-read part and a reference part
Co-Authored-By: Claude Opus 5.5 <noreply@anthropic.com>
</commit_message>
<xml_diff>
--- a/shrinkflation_poster_guide.docx
+++ b/shrinkflation_poster_guide.docx
@@ -16,7 +16,35 @@
           <w:b w:val="0"/>
           <w:color w:val="52514E"/>
         </w:rPr>
-        <w:t>DAO2702 group assignment. What each chart says, how to read it, why it is on the poster and what to answer when asked.</w:t>
+        <w:t xml:space="preserve">DAO2702 group assignment, Team Jupyter. </w:t>
+      </w:r>
+      <w:r>
+        <w:rPr>
+          <w:b/>
+          <w:color w:val="52514E"/>
+        </w:rPr>
+        <w:t>Part 1 is the must-read:</w:t>
+      </w:r>
+      <w:r>
+        <w:rPr>
+          <w:b w:val="0"/>
+          <w:color w:val="52514E"/>
+        </w:rPr>
+        <w:t xml:space="preserve"> a few pages on the project plus one short paragraph per chart. </w:t>
+      </w:r>
+      <w:r>
+        <w:rPr>
+          <w:b/>
+          <w:color w:val="52514E"/>
+        </w:rPr>
+        <w:t>Part 2 is reference.</w:t>
+      </w:r>
+      <w:r>
+        <w:rPr>
+          <w:b w:val="0"/>
+          <w:color w:val="52514E"/>
+        </w:rPr>
+        <w:t xml:space="preserve"> Nobody has to read it, but it has everything needed to explain a chart in depth or answer questions.</w:t>
       </w:r>
     </w:p>
     <w:p>
@@ -24,7 +52,18 @@
         <w:pStyle w:val="Heading1"/>
       </w:pPr>
       <w:r>
-        <w:t>1. The story in one minute</w:t>
+        <w:rPr>
+          <w:color w:val="C44E1E"/>
+        </w:rPr>
+        <w:t>Part 1: must read</w:t>
+      </w:r>
+    </w:p>
+    <w:p>
+      <w:pPr>
+        <w:pStyle w:val="Heading2"/>
+      </w:pPr>
+      <w:r>
+        <w:t>The story in one minute</w:t>
       </w:r>
     </w:p>
     <w:p>
@@ -45,10 +84,10 @@
     </w:p>
     <w:p>
       <w:pPr>
-        <w:pStyle w:val="Heading1"/>
-      </w:pPr>
-      <w:r>
-        <w:t>2. What we hand in</w:t>
+        <w:pStyle w:val="Heading2"/>
+      </w:pPr>
+      <w:r>
+        <w:t>What we hand in</w:t>
       </w:r>
     </w:p>
     <w:p>
@@ -116,15 +155,142 @@
         <w:rPr>
           <w:b w:val="0"/>
         </w:rPr>
-        <w:t xml:space="preserve"> Martin, Huaitao (Aizen) Yu, Manan, Linda, Midhvan Agarwal and Hoyoung Hwang. Before submitting, check everyone's name is spelled the way they want it on the poster, export the PDF from PowerPoint and check it is one page.</w:t>
+        <w:t xml:space="preserve"> Martin, Huaitao, Manan, Linda, Midhvan and Hoyoung. Before submitting, check everyone's name is spelled the way they want it on the poster, export the PDF from PowerPoint and check it is one page.</w:t>
       </w:r>
     </w:p>
     <w:p>
       <w:pPr>
-        <w:pStyle w:val="Heading1"/>
-      </w:pPr>
-      <w:r>
-        <w:t>3. How the poster is built</w:t>
+        <w:pStyle w:val="Heading2"/>
+      </w:pPr>
+      <w:r>
+        <w:t>The words you need</w:t>
+      </w:r>
+    </w:p>
+    <w:p>
+      <w:pPr>
+        <w:pStyle w:val="ListBullet"/>
+      </w:pPr>
+      <w:r>
+        <w:rPr>
+          <w:b/>
+        </w:rPr>
+        <w:t>Shrinkflation:</w:t>
+      </w:r>
+      <w:r>
+        <w:rPr>
+          <w:b w:val="0"/>
+        </w:rPr>
+        <w:t xml:space="preserve"> less product for the same price tag. For a home, fewer square feet for the same total price.</w:t>
+      </w:r>
+    </w:p>
+    <w:p>
+      <w:pPr>
+        <w:pStyle w:val="ListBullet"/>
+      </w:pPr>
+      <w:r>
+        <w:rPr>
+          <w:b/>
+        </w:rPr>
+        <w:t>PSF:</w:t>
+      </w:r>
+      <w:r>
+        <w:rPr>
+          <w:b w:val="0"/>
+        </w:rPr>
+        <w:t xml:space="preserve"> price per square foot. The price tag is floor area × PSF, so when PSF rises a smaller unit keeps the price tag flat.</w:t>
+      </w:r>
+    </w:p>
+    <w:p>
+      <w:pPr>
+        <w:pStyle w:val="ListBullet"/>
+      </w:pPr>
+      <w:r>
+        <w:rPr>
+          <w:b/>
+        </w:rPr>
+        <w:t>New launch vs resale:</w:t>
+      </w:r>
+      <w:r>
+        <w:rPr>
+          <w:b w:val="0"/>
+        </w:rPr>
+        <w:t xml:space="preserve"> bought from the developer vs second-hand.</w:t>
+      </w:r>
+    </w:p>
+    <w:p>
+      <w:pPr>
+        <w:pStyle w:val="ListBullet"/>
+      </w:pPr>
+      <w:r>
+        <w:rPr>
+          <w:b/>
+        </w:rPr>
+        <w:t>Lease-start year:</w:t>
+      </w:r>
+      <w:r>
+        <w:rPr>
+          <w:b w:val="0"/>
+        </w:rPr>
+        <w:t xml:space="preserve"> when a 99-year lease began, roughly the year the land was sold and the unit sizes were planned. We use it as a home's vintage.</w:t>
+      </w:r>
+    </w:p>
+    <w:p>
+      <w:pPr>
+        <w:pStyle w:val="ListBullet"/>
+      </w:pPr>
+      <w:r>
+        <w:rPr>
+          <w:b/>
+        </w:rPr>
+        <w:t>URA unit cap:</w:t>
+      </w:r>
+      <w:r>
+        <w:rPr>
+          <w:b w:val="0"/>
+        </w:rPr>
+        <w:t xml:space="preserve"> since 2012 a condo outside the city centre may have at most its floor area ÷ 70 m² in units, ÷ 85 m² since 2019. It limits how many homes fit in a project, which keeps the average home from getting smaller.</w:t>
+      </w:r>
+    </w:p>
+    <w:p>
+      <w:pPr>
+        <w:pStyle w:val="ListBullet"/>
+      </w:pPr>
+      <w:r>
+        <w:rPr>
+          <w:b/>
+        </w:rPr>
+        <w:t>MAS loan limit:</w:t>
+      </w:r>
+      <w:r>
+        <w:rPr>
+          <w:b w:val="0"/>
+        </w:rPr>
+        <w:t xml:space="preserve"> loan repayments can take at most 55% of income, tested at 4% interest, so income caps the price tag a household can pay.</w:t>
+      </w:r>
+    </w:p>
+    <w:p>
+      <w:pPr>
+        <w:pStyle w:val="ListBullet"/>
+      </w:pPr>
+      <w:r>
+        <w:rPr>
+          <w:b/>
+        </w:rPr>
+        <w:t>Median:</w:t>
+      </w:r>
+      <w:r>
+        <w:rPr>
+          <w:b w:val="0"/>
+        </w:rPr>
+        <w:t xml:space="preserve"> the middle value. We use it everywhere because a few huge homes would pull an average up.</w:t>
+      </w:r>
+    </w:p>
+    <w:p>
+      <w:pPr>
+        <w:pStyle w:val="Heading2"/>
+      </w:pPr>
+      <w:r>
+        <w:t>How the poster is laid out</w:t>
       </w:r>
     </w:p>
     <w:p>
@@ -141,7 +307,7 @@
         <w:rPr>
           <w:b w:val="0"/>
         </w:rPr>
-        <w:t xml:space="preserve"> the question, with one grey line underneath holding the few terms you need to read the charts. The key terms table below explains them in full.</w:t>
+        <w:t xml:space="preserve"> the question, with one grey line underneath holding the few terms you need to read the charts. Part 2 has the full definitions.</w:t>
       </w:r>
     </w:p>
     <w:p>
@@ -222,10 +388,1279 @@
     </w:p>
     <w:p>
       <w:pPr>
+        <w:pStyle w:val="Heading2"/>
+      </w:pPr>
+      <w:r>
+        <w:t>The nine charts in brief</w:t>
+      </w:r>
+    </w:p>
+    <w:p>
+      <w:r>
+        <w:rPr>
+          <w:b w:val="0"/>
+          <w:color w:val="52514E"/>
+        </w:rPr>
+        <w:t>Read the bold line out first, then point at where it comes from on the chart.</w:t>
+      </w:r>
+    </w:p>
+    <w:tbl>
+      <w:tblPr>
+        <w:tblW w:type="auto" w:w="0"/>
+        <w:tblLayout w:type="fixed"/>
+        <w:tblLook w:firstColumn="1" w:firstRow="1" w:lastColumn="0" w:lastRow="0" w:noHBand="0" w:noVBand="1" w:val="04A0"/>
+      </w:tblPr>
+      <w:tblGrid>
+        <w:gridCol w:w="3175"/>
+        <w:gridCol w:w="6236"/>
+      </w:tblGrid>
+      <w:tr>
+        <w:tc>
+          <w:tcPr>
+            <w:tcW w:type="dxa" w:w="3175"/>
+          </w:tcPr>
+          <w:p>
+            <w:pPr>
+              <w:spacing w:after="60"/>
+            </w:pPr>
+            <w:r>
+              <w:drawing>
+                <wp:inline xmlns:a="http://schemas.openxmlformats.org/drawingml/2006/main" xmlns:pic="http://schemas.openxmlformats.org/drawingml/2006/picture">
+                  <wp:extent cx="1908000" cy="1778644"/>
+                  <wp:docPr id="1" name="Picture 1"/>
+                  <wp:cNvGraphicFramePr>
+                    <a:graphicFrameLocks noChangeAspect="1"/>
+                  </wp:cNvGraphicFramePr>
+                  <a:graphic>
+                    <a:graphicData uri="http://schemas.openxmlformats.org/drawingml/2006/picture">
+                      <pic:pic>
+                        <pic:nvPicPr>
+                          <pic:cNvPr id="0" name="01_histogram.png"/>
+                          <pic:cNvPicPr/>
+                        </pic:nvPicPr>
+                        <pic:blipFill>
+                          <a:blip r:embed="rId10"/>
+                          <a:stretch>
+                            <a:fillRect/>
+                          </a:stretch>
+                        </pic:blipFill>
+                        <pic:spPr>
+                          <a:xfrm>
+                            <a:off x="0" y="0"/>
+                            <a:ext cx="1908000" cy="1778644"/>
+                          </a:xfrm>
+                          <a:prstGeom prst="rect"/>
+                        </pic:spPr>
+                      </pic:pic>
+                    </a:graphicData>
+                  </a:graphic>
+                </wp:inline>
+              </w:drawing>
+            </w:r>
+          </w:p>
+        </w:tc>
+        <w:tc>
+          <w:tcPr>
+            <w:tcW w:type="dxa" w:w="6236"/>
+          </w:tcPr>
+          <w:p>
+            <w:pPr>
+              <w:spacing w:after="60"/>
+            </w:pPr>
+            <w:r>
+              <w:rPr>
+                <w:b/>
+                <w:color w:val="C44E1E"/>
+              </w:rPr>
+              <w:t>1. New launches are 21% smaller than resale homes</w:t>
+            </w:r>
+          </w:p>
+          <w:p>
+            <w:pPr>
+              <w:spacing w:after="60"/>
+            </w:pPr>
+            <w:r>
+              <w:t>Every home sold in 2025, new launches above the line and resale homes below, in 50 sq ft bands. The median new unit has 797 sq ft against 1,012 for resale, and homes of 1,200 sq ft or more are 34% of resale sales but only 18% of new launches.</w:t>
+            </w:r>
+          </w:p>
+        </w:tc>
+      </w:tr>
+    </w:tbl>
+    <w:p>
+      <w:pPr>
+        <w:spacing w:after="40"/>
+      </w:pPr>
+    </w:p>
+    <w:tbl>
+      <w:tblPr>
+        <w:tblW w:type="auto" w:w="0"/>
+        <w:tblLayout w:type="fixed"/>
+        <w:tblLook w:firstColumn="1" w:firstRow="1" w:lastColumn="0" w:lastRow="0" w:noHBand="0" w:noVBand="1" w:val="04A0"/>
+      </w:tblPr>
+      <w:tblGrid>
+        <w:gridCol w:w="3175"/>
+        <w:gridCol w:w="6236"/>
+      </w:tblGrid>
+      <w:tr>
+        <w:tc>
+          <w:tcPr>
+            <w:tcW w:type="dxa" w:w="3175"/>
+          </w:tcPr>
+          <w:p>
+            <w:pPr>
+              <w:spacing w:after="60"/>
+            </w:pPr>
+            <w:r>
+              <w:drawing>
+                <wp:inline xmlns:a="http://schemas.openxmlformats.org/drawingml/2006/main" xmlns:pic="http://schemas.openxmlformats.org/drawingml/2006/picture">
+                  <wp:extent cx="1908000" cy="1778644"/>
+                  <wp:docPr id="2" name="Picture 2"/>
+                  <wp:cNvGraphicFramePr>
+                    <a:graphicFrameLocks noChangeAspect="1"/>
+                  </wp:cNvGraphicFramePr>
+                  <a:graphic>
+                    <a:graphicData uri="http://schemas.openxmlformats.org/drawingml/2006/picture">
+                      <pic:pic>
+                        <pic:nvPicPr>
+                          <pic:cNvPr id="0" name="02_line_vintage.png"/>
+                          <pic:cNvPicPr/>
+                        </pic:nvPicPr>
+                        <pic:blipFill>
+                          <a:blip r:embed="rId11"/>
+                          <a:stretch>
+                            <a:fillRect/>
+                          </a:stretch>
+                        </pic:blipFill>
+                        <pic:spPr>
+                          <a:xfrm>
+                            <a:off x="0" y="0"/>
+                            <a:ext cx="1908000" cy="1778644"/>
+                          </a:xfrm>
+                          <a:prstGeom prst="rect"/>
+                        </pic:spPr>
+                      </pic:pic>
+                    </a:graphicData>
+                  </a:graphic>
+                </wp:inline>
+              </w:drawing>
+            </w:r>
+          </w:p>
+        </w:tc>
+        <w:tc>
+          <w:tcPr>
+            <w:tcW w:type="dxa" w:w="6236"/>
+          </w:tcPr>
+          <w:p>
+            <w:pPr>
+              <w:spacing w:after="60"/>
+            </w:pPr>
+            <w:r>
+              <w:rPr>
+                <w:b/>
+                <w:color w:val="C44E1E"/>
+              </w:rPr>
+              <w:t>2. Homes shrank 43% for land sold after 2008</w:t>
+            </w:r>
+          </w:p>
+          <w:p>
+            <w:pPr>
+              <w:spacing w:after="60"/>
+            </w:pPr>
+            <w:r>
+              <w:t>Median floor area (line) and the middle half of units (band), by the year the land was sold. Sizes sat near 1,240 sq ft up to 2008, fell to about 710 by 2013–15 and stayed low. The two vertical lines are URA's unit cap in 2012 and its tightening in 2019.</w:t>
+            </w:r>
+          </w:p>
+        </w:tc>
+      </w:tr>
+    </w:tbl>
+    <w:p>
+      <w:pPr>
+        <w:spacing w:after="40"/>
+      </w:pPr>
+    </w:p>
+    <w:tbl>
+      <w:tblPr>
+        <w:tblW w:type="auto" w:w="0"/>
+        <w:tblLayout w:type="fixed"/>
+        <w:tblLook w:firstColumn="1" w:firstRow="1" w:lastColumn="0" w:lastRow="0" w:noHBand="0" w:noVBand="1" w:val="04A0"/>
+      </w:tblPr>
+      <w:tblGrid>
+        <w:gridCol w:w="3175"/>
+        <w:gridCol w:w="6236"/>
+      </w:tblGrid>
+      <w:tr>
+        <w:tc>
+          <w:tcPr>
+            <w:tcW w:type="dxa" w:w="3175"/>
+          </w:tcPr>
+          <w:p>
+            <w:pPr>
+              <w:spacing w:after="60"/>
+            </w:pPr>
+            <w:r>
+              <w:drawing>
+                <wp:inline xmlns:a="http://schemas.openxmlformats.org/drawingml/2006/main" xmlns:pic="http://schemas.openxmlformats.org/drawingml/2006/picture">
+                  <wp:extent cx="1908000" cy="1778644"/>
+                  <wp:docPr id="3" name="Picture 3"/>
+                  <wp:cNvGraphicFramePr>
+                    <a:graphicFrameLocks noChangeAspect="1"/>
+                  </wp:cNvGraphicFramePr>
+                  <a:graphic>
+                    <a:graphicData uri="http://schemas.openxmlformats.org/drawingml/2006/picture">
+                      <pic:pic>
+                        <pic:nvPicPr>
+                          <pic:cNvPr id="0" name="03_stacked_mix.png"/>
+                          <pic:cNvPicPr/>
+                        </pic:nvPicPr>
+                        <pic:blipFill>
+                          <a:blip r:embed="rId12"/>
+                          <a:stretch>
+                            <a:fillRect/>
+                          </a:stretch>
+                        </pic:blipFill>
+                        <pic:spPr>
+                          <a:xfrm>
+                            <a:off x="0" y="0"/>
+                            <a:ext cx="1908000" cy="1778644"/>
+                          </a:xfrm>
+                          <a:prstGeom prst="rect"/>
+                        </pic:spPr>
+                      </pic:pic>
+                    </a:graphicData>
+                  </a:graphic>
+                </wp:inline>
+              </w:drawing>
+            </w:r>
+          </w:p>
+        </w:tc>
+        <w:tc>
+          <w:tcPr>
+            <w:tcW w:type="dxa" w:w="6236"/>
+          </w:tcPr>
+          <w:p>
+            <w:pPr>
+              <w:spacing w:after="60"/>
+            </w:pPr>
+            <w:r>
+              <w:rPr>
+                <w:b/>
+                <w:color w:val="C44E1E"/>
+              </w:rPr>
+              <w:t>3. Shoeboxes rose from 1% to 13%, big homes fell from 34% to 8%</w:t>
+            </w:r>
+          </w:p>
+          <w:p>
+            <w:pPr>
+              <w:spacing w:after="60"/>
+            </w:pPr>
+            <w:r>
+              <w:t>The mix of sizes by when the land was sold, each bar adding up to 100%. Shoeboxes (orange) took off after 2008 and big homes (dark blue) almost vanished. After the 2019 cap shoeboxes fell back to 9%, but big homes never came back.</w:t>
+            </w:r>
+          </w:p>
+        </w:tc>
+      </w:tr>
+    </w:tbl>
+    <w:p>
+      <w:pPr>
+        <w:spacing w:after="40"/>
+      </w:pPr>
+    </w:p>
+    <w:tbl>
+      <w:tblPr>
+        <w:tblW w:type="auto" w:w="0"/>
+        <w:tblLayout w:type="fixed"/>
+        <w:tblLook w:firstColumn="1" w:firstRow="1" w:lastColumn="0" w:lastRow="0" w:noHBand="0" w:noVBand="1" w:val="04A0"/>
+      </w:tblPr>
+      <w:tblGrid>
+        <w:gridCol w:w="3175"/>
+        <w:gridCol w:w="6236"/>
+      </w:tblGrid>
+      <w:tr>
+        <w:tc>
+          <w:tcPr>
+            <w:tcW w:type="dxa" w:w="3175"/>
+          </w:tcPr>
+          <w:p>
+            <w:pPr>
+              <w:spacing w:after="60"/>
+            </w:pPr>
+            <w:r>
+              <w:drawing>
+                <wp:inline xmlns:a="http://schemas.openxmlformats.org/drawingml/2006/main" xmlns:pic="http://schemas.openxmlformats.org/drawingml/2006/picture">
+                  <wp:extent cx="1908000" cy="1778644"/>
+                  <wp:docPr id="4" name="Picture 4"/>
+                  <wp:cNvGraphicFramePr>
+                    <a:graphicFrameLocks noChangeAspect="1"/>
+                  </wp:cNvGraphicFramePr>
+                  <a:graphic>
+                    <a:graphicData uri="http://schemas.openxmlformats.org/drawingml/2006/picture">
+                      <pic:pic>
+                        <pic:nvPicPr>
+                          <pic:cNvPr id="0" name="04_coefficients.png"/>
+                          <pic:cNvPicPr/>
+                        </pic:nvPicPr>
+                        <pic:blipFill>
+                          <a:blip r:embed="rId13"/>
+                          <a:stretch>
+                            <a:fillRect/>
+                          </a:stretch>
+                        </pic:blipFill>
+                        <pic:spPr>
+                          <a:xfrm>
+                            <a:off x="0" y="0"/>
+                            <a:ext cx="1908000" cy="1778644"/>
+                          </a:xfrm>
+                          <a:prstGeom prst="rect"/>
+                        </pic:spPr>
+                      </pic:pic>
+                    </a:graphicData>
+                  </a:graphic>
+                </wp:inline>
+              </w:drawing>
+            </w:r>
+          </w:p>
+        </w:tc>
+        <w:tc>
+          <w:tcPr>
+            <w:tcW w:type="dxa" w:w="6236"/>
+          </w:tcPr>
+          <w:p>
+            <w:pPr>
+              <w:spacing w:after="60"/>
+            </w:pPr>
+            <w:r>
+              <w:rPr>
+                <w:b/>
+                <w:color w:val="C44E1E"/>
+              </w:rPr>
+              <w:t>4. Within the same district the gap stays at −34%</w:t>
+            </w:r>
+          </w:p>
+          <w:p>
+            <w:pPr>
+              <w:spacing w:after="60"/>
+            </w:pPr>
+            <w:r>
+              <w:t>Grey dots show how much smaller each era is than pre-2009 homes. Blue dots make the same comparison among homes in the same district, of the same type and sold in the same year. The dots barely move, so location does not explain the shrink. Lines are 95% confidence intervals.</w:t>
+            </w:r>
+          </w:p>
+        </w:tc>
+      </w:tr>
+    </w:tbl>
+    <w:p>
+      <w:pPr>
+        <w:spacing w:after="40"/>
+      </w:pPr>
+    </w:p>
+    <w:tbl>
+      <w:tblPr>
+        <w:tblW w:type="auto" w:w="0"/>
+        <w:tblLayout w:type="fixed"/>
+        <w:tblLook w:firstColumn="1" w:firstRow="1" w:lastColumn="0" w:lastRow="0" w:noHBand="0" w:noVBand="1" w:val="04A0"/>
+      </w:tblPr>
+      <w:tblGrid>
+        <w:gridCol w:w="3175"/>
+        <w:gridCol w:w="6236"/>
+      </w:tblGrid>
+      <w:tr>
+        <w:tc>
+          <w:tcPr>
+            <w:tcW w:type="dxa" w:w="3175"/>
+          </w:tcPr>
+          <w:p>
+            <w:pPr>
+              <w:spacing w:after="60"/>
+            </w:pPr>
+            <w:r>
+              <w:drawing>
+                <wp:inline xmlns:a="http://schemas.openxmlformats.org/drawingml/2006/main" xmlns:pic="http://schemas.openxmlformats.org/drawingml/2006/picture">
+                  <wp:extent cx="1908000" cy="1778644"/>
+                  <wp:docPr id="5" name="Picture 5"/>
+                  <wp:cNvGraphicFramePr>
+                    <a:graphicFrameLocks noChangeAspect="1"/>
+                  </wp:cNvGraphicFramePr>
+                  <a:graphic>
+                    <a:graphicData uri="http://schemas.openxmlformats.org/drawingml/2006/picture">
+                      <pic:pic>
+                        <pic:nvPicPr>
+                          <pic:cNvPr id="0" name="05_scatter_isoprice.png"/>
+                          <pic:cNvPicPr/>
+                        </pic:nvPicPr>
+                        <pic:blipFill>
+                          <a:blip r:embed="rId14"/>
+                          <a:stretch>
+                            <a:fillRect/>
+                          </a:stretch>
+                        </pic:blipFill>
+                        <pic:spPr>
+                          <a:xfrm>
+                            <a:off x="0" y="0"/>
+                            <a:ext cx="1908000" cy="1778644"/>
+                          </a:xfrm>
+                          <a:prstGeom prst="rect"/>
+                        </pic:spPr>
+                      </pic:pic>
+                    </a:graphicData>
+                  </a:graphic>
+                </wp:inline>
+              </w:drawing>
+            </w:r>
+          </w:p>
+        </w:tc>
+        <w:tc>
+          <w:tcPr>
+            <w:tcW w:type="dxa" w:w="6236"/>
+          </w:tcPr>
+          <w:p>
+            <w:pPr>
+              <w:spacing w:after="60"/>
+            </w:pPr>
+            <w:r>
+              <w:rPr>
+                <w:b/>
+                <w:color w:val="C44E1E"/>
+              </w:rPr>
+              <w:t>5. Shrinking cut prices to S$1.45M; after 2019 they jump to S$2.05M</w:t>
+            </w:r>
+          </w:p>
+          <w:p>
+            <w:pPr>
+              <w:spacing w:after="60"/>
+            </w:pPr>
+            <w:r>
+              <w:t>2025 prices only. Small dots are projects, big dots era medians, and every point on one grey curve costs the same. From pre-2009 homes to 2013–18 homes, size fell 40% and PSF rose 27%, so the price fell. Post-2019 homes are a bit bigger and much dearer per sq ft.</w:t>
+            </w:r>
+          </w:p>
+        </w:tc>
+      </w:tr>
+    </w:tbl>
+    <w:p>
+      <w:pPr>
+        <w:spacing w:after="40"/>
+      </w:pPr>
+    </w:p>
+    <w:tbl>
+      <w:tblPr>
+        <w:tblW w:type="auto" w:w="0"/>
+        <w:tblLayout w:type="fixed"/>
+        <w:tblLook w:firstColumn="1" w:firstRow="1" w:lastColumn="0" w:lastRow="0" w:noHBand="0" w:noVBand="1" w:val="04A0"/>
+      </w:tblPr>
+      <w:tblGrid>
+        <w:gridCol w:w="3175"/>
+        <w:gridCol w:w="6236"/>
+      </w:tblGrid>
+      <w:tr>
+        <w:tc>
+          <w:tcPr>
+            <w:tcW w:type="dxa" w:w="3175"/>
+          </w:tcPr>
+          <w:p>
+            <w:pPr>
+              <w:spacing w:after="60"/>
+            </w:pPr>
+            <w:r>
+              <w:drawing>
+                <wp:inline xmlns:a="http://schemas.openxmlformats.org/drawingml/2006/main" xmlns:pic="http://schemas.openxmlformats.org/drawingml/2006/picture">
+                  <wp:extent cx="1908000" cy="1778644"/>
+                  <wp:docPr id="6" name="Picture 6"/>
+                  <wp:cNvGraphicFramePr>
+                    <a:graphicFrameLocks noChangeAspect="1"/>
+                  </wp:cNvGraphicFramePr>
+                  <a:graphic>
+                    <a:graphicData uri="http://schemas.openxmlformats.org/drawingml/2006/picture">
+                      <pic:pic>
+                        <pic:nvPicPr>
+                          <pic:cNvPr id="0" name="06_violin_pricing.png"/>
+                          <pic:cNvPicPr/>
+                        </pic:nvPicPr>
+                        <pic:blipFill>
+                          <a:blip r:embed="rId15"/>
+                          <a:stretch>
+                            <a:fillRect/>
+                          </a:stretch>
+                        </pic:blipFill>
+                        <pic:spPr>
+                          <a:xfrm>
+                            <a:off x="0" y="0"/>
+                            <a:ext cx="1908000" cy="1778644"/>
+                          </a:xfrm>
+                          <a:prstGeom prst="rect"/>
+                        </pic:spPr>
+                      </pic:pic>
+                    </a:graphicData>
+                  </a:graphic>
+                </wp:inline>
+              </w:drawing>
+            </w:r>
+          </w:p>
+        </w:tc>
+        <w:tc>
+          <w:tcPr>
+            <w:tcW w:type="dxa" w:w="6236"/>
+          </w:tcPr>
+          <w:p>
+            <w:pPr>
+              <w:spacing w:after="60"/>
+            </w:pPr>
+            <w:r>
+              <w:rPr>
+                <w:b/>
+                <w:color w:val="C44E1E"/>
+              </w:rPr>
+              <w:t>6. Every unit size sells at its project's PSF, within 1.5%</w:t>
+            </w:r>
+          </w:p>
+          <w:p>
+            <w:pPr>
+              <w:spacing w:after="60"/>
+            </w:pPr>
+            <w:r>
+              <w:t>Each new unit's PSF compared with its own project's PSF, by unit size. Every size sits around zero, so inside a launch the price rises one for one with floor area. A smaller unit is the only way to a lower price tag.</w:t>
+            </w:r>
+          </w:p>
+        </w:tc>
+      </w:tr>
+    </w:tbl>
+    <w:p>
+      <w:pPr>
+        <w:spacing w:after="40"/>
+      </w:pPr>
+    </w:p>
+    <w:tbl>
+      <w:tblPr>
+        <w:tblW w:type="auto" w:w="0"/>
+        <w:tblLayout w:type="fixed"/>
+        <w:tblLook w:firstColumn="1" w:firstRow="1" w:lastColumn="0" w:lastRow="0" w:noHBand="0" w:noVBand="1" w:val="04A0"/>
+      </w:tblPr>
+      <w:tblGrid>
+        <w:gridCol w:w="3175"/>
+        <w:gridCol w:w="6236"/>
+      </w:tblGrid>
+      <w:tr>
+        <w:tc>
+          <w:tcPr>
+            <w:tcW w:type="dxa" w:w="3175"/>
+          </w:tcPr>
+          <w:p>
+            <w:pPr>
+              <w:spacing w:after="60"/>
+            </w:pPr>
+            <w:r>
+              <w:drawing>
+                <wp:inline xmlns:a="http://schemas.openxmlformats.org/drawingml/2006/main" xmlns:pic="http://schemas.openxmlformats.org/drawingml/2006/picture">
+                  <wp:extent cx="1908000" cy="1778644"/>
+                  <wp:docPr id="7" name="Picture 7"/>
+                  <wp:cNvGraphicFramePr>
+                    <a:graphicFrameLocks noChangeAspect="1"/>
+                  </wp:cNvGraphicFramePr>
+                  <a:graphic>
+                    <a:graphicData uri="http://schemas.openxmlformats.org/drawingml/2006/picture">
+                      <pic:pic>
+                        <pic:nvPicPr>
+                          <pic:cNvPr id="0" name="07_lollipop_macro.png"/>
+                          <pic:cNvPicPr/>
+                        </pic:nvPicPr>
+                        <pic:blipFill>
+                          <a:blip r:embed="rId16"/>
+                          <a:stretch>
+                            <a:fillRect/>
+                          </a:stretch>
+                        </pic:blipFill>
+                        <pic:spPr>
+                          <a:xfrm>
+                            <a:off x="0" y="0"/>
+                            <a:ext cx="1908000" cy="1778644"/>
+                          </a:xfrm>
+                          <a:prstGeom prst="rect"/>
+                        </pic:spPr>
+                      </pic:pic>
+                    </a:graphicData>
+                  </a:graphic>
+                </wp:inline>
+              </w:drawing>
+            </w:r>
+          </w:p>
+        </w:tc>
+        <w:tc>
+          <w:tcPr>
+            <w:tcW w:type="dxa" w:w="6236"/>
+          </w:tcPr>
+          <w:p>
+            <w:pPr>
+              <w:spacing w:after="60"/>
+            </w:pPr>
+            <w:r>
+              <w:rPr>
+                <w:b/>
+                <w:color w:val="C44E1E"/>
+              </w:rPr>
+              <w:t>7. Least affordable in 2007–13, when that land was sold</w:t>
+            </w:r>
+          </w:p>
+          <w:p>
+            <w:pPr>
+              <w:spacing w:after="60"/>
+            </w:pPr>
+            <w:r>
+              <w:t>Home prices divided by household income, against the 25-year average. Orange years were less affordable than usual. The orange run lines up with the years the land behind the smallest homes was sold.</w:t>
+            </w:r>
+          </w:p>
+        </w:tc>
+      </w:tr>
+    </w:tbl>
+    <w:p>
+      <w:pPr>
+        <w:spacing w:after="40"/>
+      </w:pPr>
+    </w:p>
+    <w:tbl>
+      <w:tblPr>
+        <w:tblW w:type="auto" w:w="0"/>
+        <w:tblLayout w:type="fixed"/>
+        <w:tblLook w:firstColumn="1" w:firstRow="1" w:lastColumn="0" w:lastRow="0" w:noHBand="0" w:noVBand="1" w:val="04A0"/>
+      </w:tblPr>
+      <w:tblGrid>
+        <w:gridCol w:w="3175"/>
+        <w:gridCol w:w="6236"/>
+      </w:tblGrid>
+      <w:tr>
+        <w:tc>
+          <w:tcPr>
+            <w:tcW w:type="dxa" w:w="3175"/>
+          </w:tcPr>
+          <w:p>
+            <w:pPr>
+              <w:spacing w:after="60"/>
+            </w:pPr>
+            <w:r>
+              <w:drawing>
+                <wp:inline xmlns:a="http://schemas.openxmlformats.org/drawingml/2006/main" xmlns:pic="http://schemas.openxmlformats.org/drawingml/2006/picture">
+                  <wp:extent cx="1908000" cy="1778644"/>
+                  <wp:docPr id="8" name="Picture 8"/>
+                  <wp:cNvGraphicFramePr>
+                    <a:graphicFrameLocks noChangeAspect="1"/>
+                  </wp:cNvGraphicFramePr>
+                  <a:graphic>
+                    <a:graphicData uri="http://schemas.openxmlformats.org/drawingml/2006/picture">
+                      <pic:pic>
+                        <pic:nvPicPr>
+                          <pic:cNvPr id="0" name="08_heatmap_tdsr.png"/>
+                          <pic:cNvPicPr/>
+                        </pic:nvPicPr>
+                        <pic:blipFill>
+                          <a:blip r:embed="rId17"/>
+                          <a:stretch>
+                            <a:fillRect/>
+                          </a:stretch>
+                        </pic:blipFill>
+                        <pic:spPr>
+                          <a:xfrm>
+                            <a:off x="0" y="0"/>
+                            <a:ext cx="1908000" cy="1778644"/>
+                          </a:xfrm>
+                          <a:prstGeom prst="rect"/>
+                        </pic:spPr>
+                      </pic:pic>
+                    </a:graphicData>
+                  </a:graphic>
+                </wp:inline>
+              </w:drawing>
+            </w:r>
+          </w:p>
+        </w:tc>
+        <w:tc>
+          <w:tcPr>
+            <w:tcW w:type="dxa" w:w="6236"/>
+          </w:tcPr>
+          <w:p>
+            <w:pPr>
+              <w:spacing w:after="60"/>
+            </w:pPr>
+            <w:r>
+              <w:rPr>
+                <w:b/>
+                <w:color w:val="C44E1E"/>
+              </w:rPr>
+              <w:t>8. The median household can borrow for under 800 sq ft</w:t>
+            </w:r>
+          </w:p>
+          <w:p>
+            <w:pPr>
+              <w:spacing w:after="60"/>
+            </w:pPr>
+            <w:r>
+              <w:t>How many sq ft a household can afford under MAS loan rules, by income (rows) and PSF (columns). Orange boxes cannot reach the 797 sq ft median new unit. At the median income of S$12,446, the 2025 launch PSF buys 743 sq ft.</w:t>
+            </w:r>
+          </w:p>
+        </w:tc>
+      </w:tr>
+    </w:tbl>
+    <w:p>
+      <w:pPr>
+        <w:spacing w:after="40"/>
+      </w:pPr>
+    </w:p>
+    <w:tbl>
+      <w:tblPr>
+        <w:tblW w:type="auto" w:w="0"/>
+        <w:tblLayout w:type="fixed"/>
+        <w:tblLook w:firstColumn="1" w:firstRow="1" w:lastColumn="0" w:lastRow="0" w:noHBand="0" w:noVBand="1" w:val="04A0"/>
+      </w:tblPr>
+      <w:tblGrid>
+        <w:gridCol w:w="3175"/>
+        <w:gridCol w:w="6236"/>
+      </w:tblGrid>
+      <w:tr>
+        <w:tc>
+          <w:tcPr>
+            <w:tcW w:type="dxa" w:w="3175"/>
+          </w:tcPr>
+          <w:p>
+            <w:pPr>
+              <w:spacing w:after="60"/>
+            </w:pPr>
+            <w:r>
+              <w:drawing>
+                <wp:inline xmlns:a="http://schemas.openxmlformats.org/drawingml/2006/main" xmlns:pic="http://schemas.openxmlformats.org/drawingml/2006/picture">
+                  <wp:extent cx="1908000" cy="1778644"/>
+                  <wp:docPr id="9" name="Picture 9"/>
+                  <wp:cNvGraphicFramePr>
+                    <a:graphicFrameLocks noChangeAspect="1"/>
+                  </wp:cNvGraphicFramePr>
+                  <a:graphic>
+                    <a:graphicData uri="http://schemas.openxmlformats.org/drawingml/2006/picture">
+                      <pic:pic>
+                        <pic:nvPicPr>
+                          <pic:cNvPr id="0" name="09_waterfall.png"/>
+                          <pic:cNvPicPr/>
+                        </pic:nvPicPr>
+                        <pic:blipFill>
+                          <a:blip r:embed="rId18"/>
+                          <a:stretch>
+                            <a:fillRect/>
+                          </a:stretch>
+                        </pic:blipFill>
+                        <pic:spPr>
+                          <a:xfrm>
+                            <a:off x="0" y="0"/>
+                            <a:ext cx="1908000" cy="1778644"/>
+                          </a:xfrm>
+                          <a:prstGeom prst="rect"/>
+                        </pic:spPr>
+                      </pic:pic>
+                    </a:graphicData>
+                  </a:graphic>
+                </wp:inline>
+              </w:drawing>
+            </w:r>
+          </w:p>
+        </w:tc>
+        <w:tc>
+          <w:tcPr>
+            <w:tcW w:type="dxa" w:w="6236"/>
+          </w:tcPr>
+          <w:p>
+            <w:pPr>
+              <w:spacing w:after="60"/>
+            </w:pPr>
+            <w:r>
+              <w:rPr>
+                <w:b/>
+                <w:color w:val="C44E1E"/>
+              </w:rPr>
+              <w:t>9. Price tag S$1.46M → S$2.18M, driven by PSF (+39%)</w:t>
+            </w:r>
+          </w:p>
+          <w:p>
+            <w:pPr>
+              <w:spacing w:after="60"/>
+            </w:pPr>
+            <w:r>
+              <w:t>The typical new-launch price from late 2020 to 2025, split into what higher PSF added (+39%) and what floor area added (+7%). Units no longer shrink, so buyers now pay the whole PSF rise.</w:t>
+            </w:r>
+          </w:p>
+        </w:tc>
+      </w:tr>
+    </w:tbl>
+    <w:p>
+      <w:pPr>
+        <w:spacing w:after="40"/>
+      </w:pPr>
+    </w:p>
+    <w:p>
+      <w:pPr>
+        <w:pStyle w:val="Heading2"/>
+      </w:pPr>
+      <w:r>
+        <w:t>How we present it (about five minutes)</w:t>
+      </w:r>
+    </w:p>
+    <w:tbl>
+      <w:tblPr>
+        <w:tblStyle w:val="TableGrid"/>
+        <w:tblW w:type="auto" w:w="0"/>
+        <w:jc w:val="center"/>
+        <w:tblLayout w:type="fixed"/>
+        <w:tblLook w:firstColumn="1" w:firstRow="1" w:lastColumn="0" w:lastRow="0" w:noHBand="0" w:noVBand="1" w:val="04A0"/>
+      </w:tblPr>
+      <w:tblGrid>
+        <w:gridCol w:w="2381"/>
+        <w:gridCol w:w="907"/>
+        <w:gridCol w:w="6123"/>
+      </w:tblGrid>
+      <w:tr>
+        <w:tc>
+          <w:tcPr>
+            <w:tcW w:type="dxa" w:w="2381"/>
+            <w:shd w:val="clear" w:color="auto" w:fill="E3ECF8"/>
+          </w:tcPr>
+          <w:p>
+            <w:pPr>
+              <w:spacing w:after="20" w:line="252" w:lineRule="auto"/>
+            </w:pPr>
+            <w:r>
+              <w:rPr>
+                <w:b/>
+                <w:sz w:val="18"/>
+              </w:rPr>
+              <w:t>Part</w:t>
+            </w:r>
+          </w:p>
+        </w:tc>
+        <w:tc>
+          <w:tcPr>
+            <w:tcW w:type="dxa" w:w="907"/>
+            <w:shd w:val="clear" w:color="auto" w:fill="E3ECF8"/>
+          </w:tcPr>
+          <w:p>
+            <w:pPr>
+              <w:spacing w:after="20" w:line="252" w:lineRule="auto"/>
+            </w:pPr>
+            <w:r>
+              <w:rPr>
+                <w:b/>
+                <w:sz w:val="18"/>
+              </w:rPr>
+              <w:t>Time</w:t>
+            </w:r>
+          </w:p>
+        </w:tc>
+        <w:tc>
+          <w:tcPr>
+            <w:tcW w:type="dxa" w:w="6123"/>
+            <w:shd w:val="clear" w:color="auto" w:fill="E3ECF8"/>
+          </w:tcPr>
+          <w:p>
+            <w:pPr>
+              <w:spacing w:after="20" w:line="252" w:lineRule="auto"/>
+            </w:pPr>
+            <w:r>
+              <w:rPr>
+                <w:b/>
+                <w:sz w:val="18"/>
+              </w:rPr>
+              <w:t>What to cover</w:t>
+            </w:r>
+          </w:p>
+        </w:tc>
+      </w:tr>
+      <w:tr>
+        <w:tc>
+          <w:tcPr>
+            <w:tcW w:type="dxa" w:w="2381"/>
+          </w:tcPr>
+          <w:p>
+            <w:pPr>
+              <w:spacing w:after="20" w:line="252" w:lineRule="auto"/>
+            </w:pPr>
+            <w:r>
+              <w:rPr>
+                <w:b/>
+                <w:sz w:val="18"/>
+              </w:rPr>
+              <w:t>Question and key terms</w:t>
+            </w:r>
+          </w:p>
+        </w:tc>
+        <w:tc>
+          <w:tcPr>
+            <w:tcW w:type="dxa" w:w="907"/>
+          </w:tcPr>
+          <w:p>
+            <w:pPr>
+              <w:spacing w:after="20" w:line="252" w:lineRule="auto"/>
+            </w:pPr>
+            <w:r>
+              <w:rPr>
+                <w:b w:val="0"/>
+                <w:sz w:val="18"/>
+              </w:rPr>
+              <w:t>40 s</w:t>
+            </w:r>
+          </w:p>
+        </w:tc>
+        <w:tc>
+          <w:tcPr>
+            <w:tcW w:type="dxa" w:w="6123"/>
+          </w:tcPr>
+          <w:p>
+            <w:pPr>
+              <w:spacing w:after="20" w:line="252" w:lineRule="auto"/>
+            </w:pPr>
+            <w:r>
+              <w:rPr>
+                <w:b w:val="0"/>
+                <w:sz w:val="18"/>
+              </w:rPr>
+              <w:t>The question, shrinkflation, price tag = floor area × PSF, lease-start year.</w:t>
+            </w:r>
+          </w:p>
+        </w:tc>
+      </w:tr>
+      <w:tr>
+        <w:tc>
+          <w:tcPr>
+            <w:tcW w:type="dxa" w:w="2381"/>
+          </w:tcPr>
+          <w:p>
+            <w:pPr>
+              <w:spacing w:after="20" w:line="252" w:lineRule="auto"/>
+            </w:pPr>
+            <w:r>
+              <w:rPr>
+                <w:b/>
+                <w:sz w:val="18"/>
+              </w:rPr>
+              <w:t>Row 1: what shrank</w:t>
+            </w:r>
+          </w:p>
+        </w:tc>
+        <w:tc>
+          <w:tcPr>
+            <w:tcW w:type="dxa" w:w="907"/>
+          </w:tcPr>
+          <w:p>
+            <w:pPr>
+              <w:spacing w:after="20" w:line="252" w:lineRule="auto"/>
+            </w:pPr>
+            <w:r>
+              <w:rPr>
+                <w:b w:val="0"/>
+                <w:sz w:val="18"/>
+              </w:rPr>
+              <w:t>80 s</w:t>
+            </w:r>
+          </w:p>
+        </w:tc>
+        <w:tc>
+          <w:tcPr>
+            <w:tcW w:type="dxa" w:w="6123"/>
+          </w:tcPr>
+          <w:p>
+            <w:pPr>
+              <w:spacing w:after="20" w:line="252" w:lineRule="auto"/>
+            </w:pPr>
+            <w:r>
+              <w:rPr>
+                <w:b w:val="0"/>
+                <w:sz w:val="18"/>
+              </w:rPr>
+              <w:t>Charts 1 to 3. Today's gap, when it opened, which sizes went.</w:t>
+            </w:r>
+          </w:p>
+        </w:tc>
+      </w:tr>
+      <w:tr>
+        <w:tc>
+          <w:tcPr>
+            <w:tcW w:type="dxa" w:w="2381"/>
+          </w:tcPr>
+          <w:p>
+            <w:pPr>
+              <w:spacing w:after="20" w:line="252" w:lineRule="auto"/>
+            </w:pPr>
+            <w:r>
+              <w:rPr>
+                <w:b/>
+                <w:sz w:val="18"/>
+              </w:rPr>
+              <w:t>Row 2: real and how</w:t>
+            </w:r>
+          </w:p>
+        </w:tc>
+        <w:tc>
+          <w:tcPr>
+            <w:tcW w:type="dxa" w:w="907"/>
+          </w:tcPr>
+          <w:p>
+            <w:pPr>
+              <w:spacing w:after="20" w:line="252" w:lineRule="auto"/>
+            </w:pPr>
+            <w:r>
+              <w:rPr>
+                <w:b w:val="0"/>
+                <w:sz w:val="18"/>
+              </w:rPr>
+              <w:t>80 s</w:t>
+            </w:r>
+          </w:p>
+        </w:tc>
+        <w:tc>
+          <w:tcPr>
+            <w:tcW w:type="dxa" w:w="6123"/>
+          </w:tcPr>
+          <w:p>
+            <w:pPr>
+              <w:spacing w:after="20" w:line="252" w:lineRule="auto"/>
+            </w:pPr>
+            <w:r>
+              <w:rPr>
+                <w:b w:val="0"/>
+                <w:sz w:val="18"/>
+              </w:rPr>
+              <w:t>Charts 4 to 6. Not location, the price-tag trade, priced per sq ft.</w:t>
+            </w:r>
+          </w:p>
+        </w:tc>
+      </w:tr>
+      <w:tr>
+        <w:tc>
+          <w:tcPr>
+            <w:tcW w:type="dxa" w:w="2381"/>
+          </w:tcPr>
+          <w:p>
+            <w:pPr>
+              <w:spacing w:after="20" w:line="252" w:lineRule="auto"/>
+            </w:pPr>
+            <w:r>
+              <w:rPr>
+                <w:b/>
+                <w:sz w:val="18"/>
+              </w:rPr>
+              <w:t>Row 3: why and what changed</w:t>
+            </w:r>
+          </w:p>
+        </w:tc>
+        <w:tc>
+          <w:tcPr>
+            <w:tcW w:type="dxa" w:w="907"/>
+          </w:tcPr>
+          <w:p>
+            <w:pPr>
+              <w:spacing w:after="20" w:line="252" w:lineRule="auto"/>
+            </w:pPr>
+            <w:r>
+              <w:rPr>
+                <w:b w:val="0"/>
+                <w:sz w:val="18"/>
+              </w:rPr>
+              <w:t>80 s</w:t>
+            </w:r>
+          </w:p>
+        </w:tc>
+        <w:tc>
+          <w:tcPr>
+            <w:tcW w:type="dxa" w:w="6123"/>
+          </w:tcPr>
+          <w:p>
+            <w:pPr>
+              <w:spacing w:after="20" w:line="252" w:lineRule="auto"/>
+            </w:pPr>
+            <w:r>
+              <w:rPr>
+                <w:b w:val="0"/>
+                <w:sz w:val="18"/>
+              </w:rPr>
+              <w:t>Charts 7 to 9. Affordability, borrowing limits, the price tag after the cap.</w:t>
+            </w:r>
+          </w:p>
+        </w:tc>
+      </w:tr>
+      <w:tr>
+        <w:tc>
+          <w:tcPr>
+            <w:tcW w:type="dxa" w:w="2381"/>
+          </w:tcPr>
+          <w:p>
+            <w:pPr>
+              <w:spacing w:after="20" w:line="252" w:lineRule="auto"/>
+            </w:pPr>
+            <w:r>
+              <w:rPr>
+                <w:b/>
+                <w:sz w:val="18"/>
+              </w:rPr>
+              <w:t>Answer</w:t>
+            </w:r>
+          </w:p>
+        </w:tc>
+        <w:tc>
+          <w:tcPr>
+            <w:tcW w:type="dxa" w:w="907"/>
+          </w:tcPr>
+          <w:p>
+            <w:pPr>
+              <w:spacing w:after="20" w:line="252" w:lineRule="auto"/>
+            </w:pPr>
+            <w:r>
+              <w:rPr>
+                <w:b w:val="0"/>
+                <w:sz w:val="18"/>
+              </w:rPr>
+              <w:t>40 s</w:t>
+            </w:r>
+          </w:p>
+        </w:tc>
+        <w:tc>
+          <w:tcPr>
+            <w:tcW w:type="dxa" w:w="6123"/>
+          </w:tcPr>
+          <w:p>
+            <w:pPr>
+              <w:spacing w:after="20" w:line="252" w:lineRule="auto"/>
+            </w:pPr>
+            <w:r>
+              <w:rPr>
+                <w:b w:val="0"/>
+                <w:sz w:val="18"/>
+              </w:rPr>
+              <w:t>The answer line, the three findings, what it means for buyers and policy.</w:t>
+            </w:r>
+          </w:p>
+        </w:tc>
+      </w:tr>
+    </w:tbl>
+    <w:p/>
+    <w:p>
+      <w:r>
+        <w:rPr>
+          <w:b w:val="0"/>
+        </w:rPr>
+        <w:t>Lines you can say, one per part:</w:t>
+      </w:r>
+    </w:p>
+    <w:p>
+      <w:pPr>
+        <w:pStyle w:val="ListBullet"/>
+      </w:pPr>
+      <w:r>
+        <w:rPr>
+          <w:b/>
+        </w:rPr>
+        <w:t>Open:</w:t>
+      </w:r>
+      <w:r>
+        <w:rPr>
+          <w:b w:val="0"/>
+        </w:rPr>
+        <w:t xml:space="preserve"> "Shrinkflation is less product for the same price tag. We asked whether Singapore's private homes did that, and whether it is still happening."</w:t>
+      </w:r>
+    </w:p>
+    <w:p>
+      <w:pPr>
+        <w:pStyle w:val="ListBullet"/>
+      </w:pPr>
+      <w:r>
+        <w:rPr>
+          <w:b/>
+        </w:rPr>
+        <w:t>Row 1:</w:t>
+      </w:r>
+      <w:r>
+        <w:rPr>
+          <w:b w:val="0"/>
+        </w:rPr>
+        <w:t xml:space="preserve"> "Today's new launches are 21% smaller than resale homes. The drop came with land sold after 2008, 43% in five years, and the big homes are what disappeared."</w:t>
+      </w:r>
+    </w:p>
+    <w:p>
+      <w:pPr>
+        <w:pStyle w:val="ListBullet"/>
+      </w:pPr>
+      <w:r>
+        <w:rPr>
+          <w:b/>
+        </w:rPr>
+        <w:t>Row 2:</w:t>
+      </w:r>
+      <w:r>
+        <w:rPr>
+          <w:b w:val="0"/>
+        </w:rPr>
+        <w:t xml:space="preserve"> "It is the same inside every district, so it is not location. And because launches are priced per square foot, a smaller home really does mean a lower price tag."</w:t>
+      </w:r>
+    </w:p>
+    <w:p>
+      <w:pPr>
+        <w:pStyle w:val="ListBullet"/>
+      </w:pPr>
+      <w:r>
+        <w:rPr>
+          <w:b/>
+        </w:rPr>
+        <w:t>Row 3:</w:t>
+      </w:r>
+      <w:r>
+        <w:rPr>
+          <w:b w:val="0"/>
+        </w:rPr>
+        <w:t xml:space="preserve"> "It happened when prices were furthest ahead of incomes. Then URA capped it, so now the price tag rises instead: plus 49% since 2020, at the edge of what a median household can borrow."</w:t>
+      </w:r>
+    </w:p>
+    <w:p>
+      <w:pPr>
+        <w:pStyle w:val="ListBullet"/>
+      </w:pPr>
+      <w:r>
+        <w:rPr>
+          <w:b/>
+        </w:rPr>
+        <w:t>Close:</w:t>
+      </w:r>
+      <w:r>
+        <w:rPr>
+          <w:b w:val="0"/>
+        </w:rPr>
+        <w:t xml:space="preserve"> "So yes, homes shrank to stay affordable, until the rules stopped it. For a buyer, compare price per square foot, not the price tag."</w:t>
+      </w:r>
+    </w:p>
+    <w:p>
+      <w:pPr>
+        <w:pStyle w:val="ListBullet"/>
+      </w:pPr>
+      <w:r>
+        <w:rPr>
+          <w:b w:val="0"/>
+        </w:rPr>
+        <w:t>Say each chart's bold takeaway first, then point at the part of the chart it comes from. Do not read the guide out loud.</w:t>
+      </w:r>
+    </w:p>
+    <w:p>
+      <w:pPr>
         <w:pStyle w:val="Heading1"/>
-      </w:pPr>
-      <w:r>
-        <w:t>4. Key terms</w:t>
+        <w:pageBreakBefore/>
+      </w:pPr>
+      <w:r>
+        <w:rPr>
+          <w:color w:val="C44E1E"/>
+        </w:rPr>
+        <w:t>Part 2: reference, read if you need it</w:t>
+      </w:r>
+    </w:p>
+    <w:p>
+      <w:r>
+        <w:rPr>
+          <w:b w:val="0"/>
+          <w:color w:val="52514E"/>
+        </w:rPr>
+        <w:t>Everything below backs up Part 1: full definitions, the URA cap, the statistics, the data, a full page per chart with method, caveats and likely questions, the numbers to remember and the sources.</w:t>
+      </w:r>
+    </w:p>
+    <w:p>
+      <w:pPr>
+        <w:pStyle w:val="Heading2"/>
+      </w:pPr>
+      <w:r>
+        <w:t>Key terms in full</w:t>
       </w:r>
     </w:p>
     <w:tbl>
@@ -831,10 +2266,10 @@
     <w:p/>
     <w:p>
       <w:pPr>
-        <w:pStyle w:val="Heading1"/>
-      </w:pPr>
-      <w:r>
-        <w:t>5. Background in two minutes</w:t>
+        <w:pStyle w:val="Heading2"/>
+      </w:pPr>
+      <w:r>
+        <w:t>Background in two minutes</w:t>
       </w:r>
     </w:p>
     <w:p>
@@ -883,10 +2318,10 @@
     </w:p>
     <w:p>
       <w:pPr>
-        <w:pStyle w:val="Heading1"/>
-      </w:pPr>
-      <w:r>
-        <w:t>6. The URA unit cap in detail</w:t>
+        <w:pStyle w:val="Heading2"/>
+      </w:pPr>
+      <w:r>
+        <w:t>The URA unit cap in detail</w:t>
       </w:r>
     </w:p>
     <w:p>
@@ -1049,10 +2484,10 @@
     </w:p>
     <w:p>
       <w:pPr>
-        <w:pStyle w:val="Heading1"/>
-      </w:pPr>
-      <w:r>
-        <w:t>7. Reading the statistics</w:t>
+        <w:pStyle w:val="Heading2"/>
+      </w:pPr>
+      <w:r>
+        <w:t>Reading the statistics</w:t>
       </w:r>
     </w:p>
     <w:tbl>
@@ -1552,10 +2987,10 @@
     <w:p/>
     <w:p>
       <w:pPr>
-        <w:pStyle w:val="Heading1"/>
-      </w:pPr>
-      <w:r>
-        <w:t>8. Data and cleaning</w:t>
+        <w:pStyle w:val="Heading2"/>
+      </w:pPr>
+      <w:r>
+        <w:t>Data and cleaning</w:t>
       </w:r>
     </w:p>
     <w:p>
@@ -1662,10 +3097,10 @@
     </w:p>
     <w:p>
       <w:pPr>
-        <w:pStyle w:val="Heading1"/>
-      </w:pPr>
-      <w:r>
-        <w:t>9. Files and how to rerun</w:t>
+        <w:pStyle w:val="Heading2"/>
+      </w:pPr>
+      <w:r>
+        <w:t>Files and how to rerun</w:t>
       </w:r>
     </w:p>
     <w:p>
@@ -1728,11 +3163,11 @@
     </w:p>
     <w:p>
       <w:pPr>
-        <w:pStyle w:val="Heading1"/>
+        <w:pStyle w:val="Heading2"/>
         <w:pageBreakBefore/>
       </w:pPr>
       <w:r>
-        <w:t>10. Chart by chart</w:t>
+        <w:t>Chart by chart in depth</w:t>
       </w:r>
     </w:p>
     <w:p>
@@ -1745,7 +3180,7 @@
     </w:p>
     <w:p>
       <w:pPr>
-        <w:pStyle w:val="Heading2"/>
+        <w:pStyle w:val="Heading3"/>
         <w:pageBreakBefore w:val="0"/>
       </w:pPr>
       <w:r>
@@ -1773,7 +3208,7 @@
         <w:drawing>
           <wp:inline xmlns:a="http://schemas.openxmlformats.org/drawingml/2006/main" xmlns:pic="http://schemas.openxmlformats.org/drawingml/2006/picture">
             <wp:extent cx="2844000" cy="2651186"/>
-            <wp:docPr id="1" name="Picture 1"/>
+            <wp:docPr id="10" name="Picture 10"/>
             <wp:cNvGraphicFramePr>
               <a:graphicFrameLocks noChangeAspect="1"/>
             </wp:cNvGraphicFramePr>
@@ -1806,7 +3241,7 @@
     </w:p>
     <w:p>
       <w:pPr>
-        <w:pStyle w:val="Heading3"/>
+        <w:pStyle w:val="Heading4"/>
       </w:pPr>
       <w:r>
         <w:t>What it shows</w:t>
@@ -1822,7 +3257,7 @@
     </w:p>
     <w:p>
       <w:pPr>
-        <w:pStyle w:val="Heading3"/>
+        <w:pStyle w:val="Heading4"/>
       </w:pPr>
       <w:r>
         <w:t>How to read it</w:t>
@@ -1863,7 +3298,7 @@
     </w:p>
     <w:p>
       <w:pPr>
-        <w:pStyle w:val="Heading3"/>
+        <w:pStyle w:val="Heading4"/>
       </w:pPr>
       <w:r>
         <w:t>Why this chart</w:t>
@@ -1879,7 +3314,7 @@
     </w:p>
     <w:p>
       <w:pPr>
-        <w:pStyle w:val="Heading3"/>
+        <w:pStyle w:val="Heading4"/>
       </w:pPr>
       <w:r>
         <w:t>Watch out for</w:t>
@@ -1895,7 +3330,7 @@
     </w:p>
     <w:p>
       <w:pPr>
-        <w:pStyle w:val="Heading3"/>
+        <w:pStyle w:val="Heading4"/>
       </w:pPr>
       <w:r>
         <w:t>If someone asks</w:t>
@@ -1938,7 +3373,7 @@
     </w:p>
     <w:p>
       <w:pPr>
-        <w:pStyle w:val="Heading2"/>
+        <w:pStyle w:val="Heading3"/>
         <w:pageBreakBefore w:val="0"/>
       </w:pPr>
       <w:r>
@@ -1966,7 +3401,7 @@
         <w:drawing>
           <wp:inline xmlns:a="http://schemas.openxmlformats.org/drawingml/2006/main" xmlns:pic="http://schemas.openxmlformats.org/drawingml/2006/picture">
             <wp:extent cx="2844000" cy="2651186"/>
-            <wp:docPr id="2" name="Picture 2"/>
+            <wp:docPr id="11" name="Picture 11"/>
             <wp:cNvGraphicFramePr>
               <a:graphicFrameLocks noChangeAspect="1"/>
             </wp:cNvGraphicFramePr>
@@ -1999,7 +3434,7 @@
     </w:p>
     <w:p>
       <w:pPr>
-        <w:pStyle w:val="Heading3"/>
+        <w:pStyle w:val="Heading4"/>
       </w:pPr>
       <w:r>
         <w:t>What it shows</w:t>
@@ -2015,7 +3450,7 @@
     </w:p>
     <w:p>
       <w:pPr>
-        <w:pStyle w:val="Heading3"/>
+        <w:pStyle w:val="Heading4"/>
       </w:pPr>
       <w:r>
         <w:t>How to read it</w:t>
@@ -2067,7 +3502,7 @@
     </w:p>
     <w:p>
       <w:pPr>
-        <w:pStyle w:val="Heading3"/>
+        <w:pStyle w:val="Heading4"/>
       </w:pPr>
       <w:r>
         <w:t>Why this chart</w:t>
@@ -2083,7 +3518,7 @@
     </w:p>
     <w:p>
       <w:pPr>
-        <w:pStyle w:val="Heading3"/>
+        <w:pStyle w:val="Heading4"/>
       </w:pPr>
       <w:r>
         <w:t>Watch out for</w:t>
@@ -2099,7 +3534,7 @@
     </w:p>
     <w:p>
       <w:pPr>
-        <w:pStyle w:val="Heading3"/>
+        <w:pStyle w:val="Heading4"/>
       </w:pPr>
       <w:r>
         <w:t>If someone asks</w:t>
@@ -2142,7 +3577,7 @@
     </w:p>
     <w:p>
       <w:pPr>
-        <w:pStyle w:val="Heading2"/>
+        <w:pStyle w:val="Heading3"/>
         <w:pageBreakBefore w:val="0"/>
       </w:pPr>
       <w:r>
@@ -2170,7 +3605,7 @@
         <w:drawing>
           <wp:inline xmlns:a="http://schemas.openxmlformats.org/drawingml/2006/main" xmlns:pic="http://schemas.openxmlformats.org/drawingml/2006/picture">
             <wp:extent cx="2844000" cy="2651186"/>
-            <wp:docPr id="3" name="Picture 3"/>
+            <wp:docPr id="12" name="Picture 12"/>
             <wp:cNvGraphicFramePr>
               <a:graphicFrameLocks noChangeAspect="1"/>
             </wp:cNvGraphicFramePr>
@@ -2203,7 +3638,7 @@
     </w:p>
     <w:p>
       <w:pPr>
-        <w:pStyle w:val="Heading3"/>
+        <w:pStyle w:val="Heading4"/>
       </w:pPr>
       <w:r>
         <w:t>What it shows</w:t>
@@ -2763,7 +4198,7 @@
     <w:p/>
     <w:p>
       <w:pPr>
-        <w:pStyle w:val="Heading3"/>
+        <w:pStyle w:val="Heading4"/>
       </w:pPr>
       <w:r>
         <w:t>How to read it</w:t>
@@ -2804,7 +4239,7 @@
     </w:p>
     <w:p>
       <w:pPr>
-        <w:pStyle w:val="Heading3"/>
+        <w:pStyle w:val="Heading4"/>
       </w:pPr>
       <w:r>
         <w:t>Why this chart</w:t>
@@ -2820,7 +4255,7 @@
     </w:p>
     <w:p>
       <w:pPr>
-        <w:pStyle w:val="Heading3"/>
+        <w:pStyle w:val="Heading4"/>
       </w:pPr>
       <w:r>
         <w:t>Watch out for</w:t>
@@ -2836,7 +4271,7 @@
     </w:p>
     <w:p>
       <w:pPr>
-        <w:pStyle w:val="Heading3"/>
+        <w:pStyle w:val="Heading4"/>
       </w:pPr>
       <w:r>
         <w:t>If someone asks</w:t>
@@ -2868,7 +4303,7 @@
     </w:p>
     <w:p>
       <w:pPr>
-        <w:pStyle w:val="Heading2"/>
+        <w:pStyle w:val="Heading3"/>
         <w:pageBreakBefore w:val="0"/>
       </w:pPr>
       <w:r>
@@ -2896,7 +4331,7 @@
         <w:drawing>
           <wp:inline xmlns:a="http://schemas.openxmlformats.org/drawingml/2006/main" xmlns:pic="http://schemas.openxmlformats.org/drawingml/2006/picture">
             <wp:extent cx="2844000" cy="2651186"/>
-            <wp:docPr id="4" name="Picture 4"/>
+            <wp:docPr id="13" name="Picture 13"/>
             <wp:cNvGraphicFramePr>
               <a:graphicFrameLocks noChangeAspect="1"/>
             </wp:cNvGraphicFramePr>
@@ -2929,7 +4364,7 @@
     </w:p>
     <w:p>
       <w:pPr>
-        <w:pStyle w:val="Heading3"/>
+        <w:pStyle w:val="Heading4"/>
       </w:pPr>
       <w:r>
         <w:t>What it shows</w:t>
@@ -2945,7 +4380,7 @@
     </w:p>
     <w:p>
       <w:pPr>
-        <w:pStyle w:val="Heading3"/>
+        <w:pStyle w:val="Heading4"/>
       </w:pPr>
       <w:r>
         <w:t>How to read it</w:t>
@@ -2986,7 +4421,7 @@
     </w:p>
     <w:p>
       <w:pPr>
-        <w:pStyle w:val="Heading3"/>
+        <w:pStyle w:val="Heading4"/>
       </w:pPr>
       <w:r>
         <w:t>Why this chart</w:t>
@@ -3002,7 +4437,7 @@
     </w:p>
     <w:p>
       <w:pPr>
-        <w:pStyle w:val="Heading3"/>
+        <w:pStyle w:val="Heading4"/>
       </w:pPr>
       <w:r>
         <w:t>How it was done</w:t>
@@ -3043,7 +4478,7 @@
     </w:p>
     <w:p>
       <w:pPr>
-        <w:pStyle w:val="Heading3"/>
+        <w:pStyle w:val="Heading4"/>
       </w:pPr>
       <w:r>
         <w:t>Watch out for</w:t>
@@ -3059,7 +4494,7 @@
     </w:p>
     <w:p>
       <w:pPr>
-        <w:pStyle w:val="Heading3"/>
+        <w:pStyle w:val="Heading4"/>
       </w:pPr>
       <w:r>
         <w:t>If someone asks</w:t>
@@ -3102,7 +4537,7 @@
     </w:p>
     <w:p>
       <w:pPr>
-        <w:pStyle w:val="Heading2"/>
+        <w:pStyle w:val="Heading3"/>
         <w:pageBreakBefore w:val="0"/>
       </w:pPr>
       <w:r>
@@ -3130,7 +4565,7 @@
         <w:drawing>
           <wp:inline xmlns:a="http://schemas.openxmlformats.org/drawingml/2006/main" xmlns:pic="http://schemas.openxmlformats.org/drawingml/2006/picture">
             <wp:extent cx="2844000" cy="2651186"/>
-            <wp:docPr id="5" name="Picture 5"/>
+            <wp:docPr id="14" name="Picture 14"/>
             <wp:cNvGraphicFramePr>
               <a:graphicFrameLocks noChangeAspect="1"/>
             </wp:cNvGraphicFramePr>
@@ -3163,7 +4598,7 @@
     </w:p>
     <w:p>
       <w:pPr>
-        <w:pStyle w:val="Heading3"/>
+        <w:pStyle w:val="Heading4"/>
       </w:pPr>
       <w:r>
         <w:t>What it shows</w:t>
@@ -3179,7 +4614,7 @@
     </w:p>
     <w:p>
       <w:pPr>
-        <w:pStyle w:val="Heading3"/>
+        <w:pStyle w:val="Heading4"/>
       </w:pPr>
       <w:r>
         <w:t>How to read it</w:t>
@@ -3220,7 +4655,7 @@
     </w:p>
     <w:p>
       <w:pPr>
-        <w:pStyle w:val="Heading3"/>
+        <w:pStyle w:val="Heading4"/>
       </w:pPr>
       <w:r>
         <w:t>Why this chart</w:t>
@@ -3236,7 +4671,7 @@
     </w:p>
     <w:p>
       <w:pPr>
-        <w:pStyle w:val="Heading3"/>
+        <w:pStyle w:val="Heading4"/>
       </w:pPr>
       <w:r>
         <w:t>Watch out for</w:t>
@@ -3252,7 +4687,7 @@
     </w:p>
     <w:p>
       <w:pPr>
-        <w:pStyle w:val="Heading3"/>
+        <w:pStyle w:val="Heading4"/>
       </w:pPr>
       <w:r>
         <w:t>If someone asks</w:t>
@@ -3284,7 +4719,7 @@
     </w:p>
     <w:p>
       <w:pPr>
-        <w:pStyle w:val="Heading2"/>
+        <w:pStyle w:val="Heading3"/>
         <w:pageBreakBefore w:val="0"/>
       </w:pPr>
       <w:r>
@@ -3312,7 +4747,7 @@
         <w:drawing>
           <wp:inline xmlns:a="http://schemas.openxmlformats.org/drawingml/2006/main" xmlns:pic="http://schemas.openxmlformats.org/drawingml/2006/picture">
             <wp:extent cx="2844000" cy="2651186"/>
-            <wp:docPr id="6" name="Picture 6"/>
+            <wp:docPr id="15" name="Picture 15"/>
             <wp:cNvGraphicFramePr>
               <a:graphicFrameLocks noChangeAspect="1"/>
             </wp:cNvGraphicFramePr>
@@ -3345,7 +4780,7 @@
     </w:p>
     <w:p>
       <w:pPr>
-        <w:pStyle w:val="Heading3"/>
+        <w:pStyle w:val="Heading4"/>
       </w:pPr>
       <w:r>
         <w:t>What it shows</w:t>
@@ -3361,7 +4796,7 @@
     </w:p>
     <w:p>
       <w:pPr>
-        <w:pStyle w:val="Heading3"/>
+        <w:pStyle w:val="Heading4"/>
       </w:pPr>
       <w:r>
         <w:t>How to read it</w:t>
@@ -3402,7 +4837,7 @@
     </w:p>
     <w:p>
       <w:pPr>
-        <w:pStyle w:val="Heading3"/>
+        <w:pStyle w:val="Heading4"/>
       </w:pPr>
       <w:r>
         <w:t>Why this chart</w:t>
@@ -3418,7 +4853,7 @@
     </w:p>
     <w:p>
       <w:pPr>
-        <w:pStyle w:val="Heading3"/>
+        <w:pStyle w:val="Heading4"/>
       </w:pPr>
       <w:r>
         <w:t>Why it matters</w:t>
@@ -3434,7 +4869,7 @@
     </w:p>
     <w:p>
       <w:pPr>
-        <w:pStyle w:val="Heading3"/>
+        <w:pStyle w:val="Heading4"/>
       </w:pPr>
       <w:r>
         <w:t>Watch out for</w:t>
@@ -3450,7 +4885,7 @@
     </w:p>
     <w:p>
       <w:pPr>
-        <w:pStyle w:val="Heading3"/>
+        <w:pStyle w:val="Heading4"/>
       </w:pPr>
       <w:r>
         <w:t>If someone asks</w:t>
@@ -3482,7 +4917,7 @@
     </w:p>
     <w:p>
       <w:pPr>
-        <w:pStyle w:val="Heading2"/>
+        <w:pStyle w:val="Heading3"/>
         <w:pageBreakBefore w:val="0"/>
       </w:pPr>
       <w:r>
@@ -3510,7 +4945,7 @@
         <w:drawing>
           <wp:inline xmlns:a="http://schemas.openxmlformats.org/drawingml/2006/main" xmlns:pic="http://schemas.openxmlformats.org/drawingml/2006/picture">
             <wp:extent cx="2844000" cy="2651186"/>
-            <wp:docPr id="7" name="Picture 7"/>
+            <wp:docPr id="16" name="Picture 16"/>
             <wp:cNvGraphicFramePr>
               <a:graphicFrameLocks noChangeAspect="1"/>
             </wp:cNvGraphicFramePr>
@@ -3543,7 +4978,7 @@
     </w:p>
     <w:p>
       <w:pPr>
-        <w:pStyle w:val="Heading3"/>
+        <w:pStyle w:val="Heading4"/>
       </w:pPr>
       <w:r>
         <w:t>What it shows</w:t>
@@ -3559,7 +4994,7 @@
     </w:p>
     <w:p>
       <w:pPr>
-        <w:pStyle w:val="Heading3"/>
+        <w:pStyle w:val="Heading4"/>
       </w:pPr>
       <w:r>
         <w:t>How to read it</w:t>
@@ -3589,7 +5024,7 @@
     </w:p>
     <w:p>
       <w:pPr>
-        <w:pStyle w:val="Heading3"/>
+        <w:pStyle w:val="Heading4"/>
       </w:pPr>
       <w:r>
         <w:t>Why this chart</w:t>
@@ -3605,7 +5040,7 @@
     </w:p>
     <w:p>
       <w:pPr>
-        <w:pStyle w:val="Heading3"/>
+        <w:pStyle w:val="Heading4"/>
       </w:pPr>
       <w:r>
         <w:t>How it was done</w:t>
@@ -3646,7 +5081,7 @@
     </w:p>
     <w:p>
       <w:pPr>
-        <w:pStyle w:val="Heading3"/>
+        <w:pStyle w:val="Heading4"/>
       </w:pPr>
       <w:r>
         <w:t>Watch out for</w:t>
@@ -3662,7 +5097,7 @@
     </w:p>
     <w:p>
       <w:pPr>
-        <w:pStyle w:val="Heading3"/>
+        <w:pStyle w:val="Heading4"/>
       </w:pPr>
       <w:r>
         <w:t>If someone asks</w:t>
@@ -3694,7 +5129,7 @@
     </w:p>
     <w:p>
       <w:pPr>
-        <w:pStyle w:val="Heading2"/>
+        <w:pStyle w:val="Heading3"/>
         <w:pageBreakBefore w:val="0"/>
       </w:pPr>
       <w:r>
@@ -3722,7 +5157,7 @@
         <w:drawing>
           <wp:inline xmlns:a="http://schemas.openxmlformats.org/drawingml/2006/main" xmlns:pic="http://schemas.openxmlformats.org/drawingml/2006/picture">
             <wp:extent cx="2844000" cy="2651186"/>
-            <wp:docPr id="8" name="Picture 8"/>
+            <wp:docPr id="17" name="Picture 17"/>
             <wp:cNvGraphicFramePr>
               <a:graphicFrameLocks noChangeAspect="1"/>
             </wp:cNvGraphicFramePr>
@@ -3755,7 +5190,7 @@
     </w:p>
     <w:p>
       <w:pPr>
-        <w:pStyle w:val="Heading3"/>
+        <w:pStyle w:val="Heading4"/>
       </w:pPr>
       <w:r>
         <w:t>What it shows</w:t>
@@ -3771,7 +5206,7 @@
     </w:p>
     <w:p>
       <w:pPr>
-        <w:pStyle w:val="Heading3"/>
+        <w:pStyle w:val="Heading4"/>
       </w:pPr>
       <w:r>
         <w:t>How to read it</w:t>
@@ -3823,7 +5258,7 @@
     </w:p>
     <w:p>
       <w:pPr>
-        <w:pStyle w:val="Heading3"/>
+        <w:pStyle w:val="Heading4"/>
       </w:pPr>
       <w:r>
         <w:t>Why this chart</w:t>
@@ -3839,7 +5274,7 @@
     </w:p>
     <w:p>
       <w:pPr>
-        <w:pStyle w:val="Heading3"/>
+        <w:pStyle w:val="Heading4"/>
       </w:pPr>
       <w:r>
         <w:t>Worked example</w:t>
@@ -3891,7 +5326,7 @@
     </w:p>
     <w:p>
       <w:pPr>
-        <w:pStyle w:val="Heading3"/>
+        <w:pStyle w:val="Heading4"/>
       </w:pPr>
       <w:r>
         <w:t>Watch out for</w:t>
@@ -3907,7 +5342,7 @@
     </w:p>
     <w:p>
       <w:pPr>
-        <w:pStyle w:val="Heading3"/>
+        <w:pStyle w:val="Heading4"/>
       </w:pPr>
       <w:r>
         <w:t>If someone asks</w:t>
@@ -3950,7 +5385,7 @@
     </w:p>
     <w:p>
       <w:pPr>
-        <w:pStyle w:val="Heading2"/>
+        <w:pStyle w:val="Heading3"/>
         <w:pageBreakBefore w:val="0"/>
       </w:pPr>
       <w:r>
@@ -3978,7 +5413,7 @@
         <w:drawing>
           <wp:inline xmlns:a="http://schemas.openxmlformats.org/drawingml/2006/main" xmlns:pic="http://schemas.openxmlformats.org/drawingml/2006/picture">
             <wp:extent cx="2844000" cy="2651186"/>
-            <wp:docPr id="9" name="Picture 9"/>
+            <wp:docPr id="18" name="Picture 18"/>
             <wp:cNvGraphicFramePr>
               <a:graphicFrameLocks noChangeAspect="1"/>
             </wp:cNvGraphicFramePr>
@@ -4011,7 +5446,7 @@
     </w:p>
     <w:p>
       <w:pPr>
-        <w:pStyle w:val="Heading3"/>
+        <w:pStyle w:val="Heading4"/>
       </w:pPr>
       <w:r>
         <w:t>What it shows</w:t>
@@ -4027,7 +5462,7 @@
     </w:p>
     <w:p>
       <w:pPr>
-        <w:pStyle w:val="Heading3"/>
+        <w:pStyle w:val="Heading4"/>
       </w:pPr>
       <w:r>
         <w:t>How to read it</w:t>
@@ -4057,7 +5492,7 @@
     </w:p>
     <w:p>
       <w:pPr>
-        <w:pStyle w:val="Heading3"/>
+        <w:pStyle w:val="Heading4"/>
       </w:pPr>
       <w:r>
         <w:t>Why this chart</w:t>
@@ -4073,7 +5508,7 @@
     </w:p>
     <w:p>
       <w:pPr>
-        <w:pStyle w:val="Heading3"/>
+        <w:pStyle w:val="Heading4"/>
       </w:pPr>
       <w:r>
         <w:t>How it was done</w:t>
@@ -4103,7 +5538,7 @@
     </w:p>
     <w:p>
       <w:pPr>
-        <w:pStyle w:val="Heading3"/>
+        <w:pStyle w:val="Heading4"/>
       </w:pPr>
       <w:r>
         <w:t>Watch out for</w:t>
@@ -4119,7 +5554,7 @@
     </w:p>
     <w:p>
       <w:pPr>
-        <w:pStyle w:val="Heading3"/>
+        <w:pStyle w:val="Heading4"/>
       </w:pPr>
       <w:r>
         <w:t>If someone asks</w:t>
@@ -4138,10 +5573,10 @@
     </w:p>
     <w:p>
       <w:pPr>
-        <w:pStyle w:val="Heading1"/>
-      </w:pPr>
-      <w:r>
-        <w:t>11. Design choices across the poster</w:t>
+        <w:pStyle w:val="Heading2"/>
+      </w:pPr>
+      <w:r>
+        <w:t>Design choices across the poster</w:t>
       </w:r>
     </w:p>
     <w:p>
@@ -4212,10 +5647,10 @@
     </w:p>
     <w:p>
       <w:pPr>
-        <w:pStyle w:val="Heading1"/>
-      </w:pPr>
-      <w:r>
-        <w:t>12. Limitations</w:t>
+        <w:pStyle w:val="Heading2"/>
+      </w:pPr>
+      <w:r>
+        <w:t>Limitations</w:t>
       </w:r>
     </w:p>
     <w:p>
@@ -4297,10 +5732,10 @@
     </w:p>
     <w:p>
       <w:pPr>
-        <w:pStyle w:val="Heading1"/>
-      </w:pPr>
-      <w:r>
-        <w:t>13. Key numbers to remember</w:t>
+        <w:pStyle w:val="Heading2"/>
+      </w:pPr>
+      <w:r>
+        <w:t>Key numbers to remember</w:t>
       </w:r>
     </w:p>
     <w:tbl>
@@ -5012,10 +6447,10 @@
     <w:p/>
     <w:p>
       <w:pPr>
-        <w:pStyle w:val="Heading1"/>
-      </w:pPr>
-      <w:r>
-        <w:t>14. Questions to expect</w:t>
+        <w:pStyle w:val="Heading2"/>
+      </w:pPr>
+      <w:r>
+        <w:t>Questions to expect</w:t>
       </w:r>
     </w:p>
     <w:p>
@@ -5160,458 +6595,10 @@
     </w:p>
     <w:p>
       <w:pPr>
-        <w:pStyle w:val="Heading1"/>
-      </w:pPr>
-      <w:r>
-        <w:t>15. Presenting it in about five minutes</w:t>
-      </w:r>
-    </w:p>
-    <w:tbl>
-      <w:tblPr>
-        <w:tblStyle w:val="TableGrid"/>
-        <w:tblW w:type="auto" w:w="0"/>
-        <w:jc w:val="center"/>
-        <w:tblLayout w:type="fixed"/>
-        <w:tblLook w:firstColumn="1" w:firstRow="1" w:lastColumn="0" w:lastRow="0" w:noHBand="0" w:noVBand="1" w:val="04A0"/>
-      </w:tblPr>
-      <w:tblGrid>
-        <w:gridCol w:w="2381"/>
-        <w:gridCol w:w="907"/>
-        <w:gridCol w:w="6123"/>
-      </w:tblGrid>
-      <w:tr>
-        <w:tc>
-          <w:tcPr>
-            <w:tcW w:type="dxa" w:w="2381"/>
-            <w:shd w:val="clear" w:color="auto" w:fill="E3ECF8"/>
-          </w:tcPr>
-          <w:p>
-            <w:pPr>
-              <w:spacing w:after="20" w:line="252" w:lineRule="auto"/>
-            </w:pPr>
-            <w:r>
-              <w:rPr>
-                <w:b/>
-                <w:sz w:val="18"/>
-              </w:rPr>
-              <w:t>Part</w:t>
-            </w:r>
-          </w:p>
-        </w:tc>
-        <w:tc>
-          <w:tcPr>
-            <w:tcW w:type="dxa" w:w="907"/>
-            <w:shd w:val="clear" w:color="auto" w:fill="E3ECF8"/>
-          </w:tcPr>
-          <w:p>
-            <w:pPr>
-              <w:spacing w:after="20" w:line="252" w:lineRule="auto"/>
-            </w:pPr>
-            <w:r>
-              <w:rPr>
-                <w:b/>
-                <w:sz w:val="18"/>
-              </w:rPr>
-              <w:t>Time</w:t>
-            </w:r>
-          </w:p>
-        </w:tc>
-        <w:tc>
-          <w:tcPr>
-            <w:tcW w:type="dxa" w:w="6123"/>
-            <w:shd w:val="clear" w:color="auto" w:fill="E3ECF8"/>
-          </w:tcPr>
-          <w:p>
-            <w:pPr>
-              <w:spacing w:after="20" w:line="252" w:lineRule="auto"/>
-            </w:pPr>
-            <w:r>
-              <w:rPr>
-                <w:b/>
-                <w:sz w:val="18"/>
-              </w:rPr>
-              <w:t>What to cover</w:t>
-            </w:r>
-          </w:p>
-        </w:tc>
-      </w:tr>
-      <w:tr>
-        <w:tc>
-          <w:tcPr>
-            <w:tcW w:type="dxa" w:w="2381"/>
-          </w:tcPr>
-          <w:p>
-            <w:pPr>
-              <w:spacing w:after="20" w:line="252" w:lineRule="auto"/>
-            </w:pPr>
-            <w:r>
-              <w:rPr>
-                <w:b/>
-                <w:sz w:val="18"/>
-              </w:rPr>
-              <w:t>Question and key terms</w:t>
-            </w:r>
-          </w:p>
-        </w:tc>
-        <w:tc>
-          <w:tcPr>
-            <w:tcW w:type="dxa" w:w="907"/>
-          </w:tcPr>
-          <w:p>
-            <w:pPr>
-              <w:spacing w:after="20" w:line="252" w:lineRule="auto"/>
-            </w:pPr>
-            <w:r>
-              <w:rPr>
-                <w:b w:val="0"/>
-                <w:sz w:val="18"/>
-              </w:rPr>
-              <w:t>40 s</w:t>
-            </w:r>
-          </w:p>
-        </w:tc>
-        <w:tc>
-          <w:tcPr>
-            <w:tcW w:type="dxa" w:w="6123"/>
-          </w:tcPr>
-          <w:p>
-            <w:pPr>
-              <w:spacing w:after="20" w:line="252" w:lineRule="auto"/>
-            </w:pPr>
-            <w:r>
-              <w:rPr>
-                <w:b w:val="0"/>
-                <w:sz w:val="18"/>
-              </w:rPr>
-              <w:t>The question, shrinkflation, price tag = floor area × PSF, lease-start year.</w:t>
-            </w:r>
-          </w:p>
-        </w:tc>
-      </w:tr>
-      <w:tr>
-        <w:tc>
-          <w:tcPr>
-            <w:tcW w:type="dxa" w:w="2381"/>
-          </w:tcPr>
-          <w:p>
-            <w:pPr>
-              <w:spacing w:after="20" w:line="252" w:lineRule="auto"/>
-            </w:pPr>
-            <w:r>
-              <w:rPr>
-                <w:b/>
-                <w:sz w:val="18"/>
-              </w:rPr>
-              <w:t>Row 1: what shrank</w:t>
-            </w:r>
-          </w:p>
-        </w:tc>
-        <w:tc>
-          <w:tcPr>
-            <w:tcW w:type="dxa" w:w="907"/>
-          </w:tcPr>
-          <w:p>
-            <w:pPr>
-              <w:spacing w:after="20" w:line="252" w:lineRule="auto"/>
-            </w:pPr>
-            <w:r>
-              <w:rPr>
-                <w:b w:val="0"/>
-                <w:sz w:val="18"/>
-              </w:rPr>
-              <w:t>80 s</w:t>
-            </w:r>
-          </w:p>
-        </w:tc>
-        <w:tc>
-          <w:tcPr>
-            <w:tcW w:type="dxa" w:w="6123"/>
-          </w:tcPr>
-          <w:p>
-            <w:pPr>
-              <w:spacing w:after="20" w:line="252" w:lineRule="auto"/>
-            </w:pPr>
-            <w:r>
-              <w:rPr>
-                <w:b w:val="0"/>
-                <w:sz w:val="18"/>
-              </w:rPr>
-              <w:t>Charts 1 to 3. Today's gap, when it opened, which sizes went.</w:t>
-            </w:r>
-          </w:p>
-        </w:tc>
-      </w:tr>
-      <w:tr>
-        <w:tc>
-          <w:tcPr>
-            <w:tcW w:type="dxa" w:w="2381"/>
-          </w:tcPr>
-          <w:p>
-            <w:pPr>
-              <w:spacing w:after="20" w:line="252" w:lineRule="auto"/>
-            </w:pPr>
-            <w:r>
-              <w:rPr>
-                <w:b/>
-                <w:sz w:val="18"/>
-              </w:rPr>
-              <w:t>Row 2: real and how</w:t>
-            </w:r>
-          </w:p>
-        </w:tc>
-        <w:tc>
-          <w:tcPr>
-            <w:tcW w:type="dxa" w:w="907"/>
-          </w:tcPr>
-          <w:p>
-            <w:pPr>
-              <w:spacing w:after="20" w:line="252" w:lineRule="auto"/>
-            </w:pPr>
-            <w:r>
-              <w:rPr>
-                <w:b w:val="0"/>
-                <w:sz w:val="18"/>
-              </w:rPr>
-              <w:t>80 s</w:t>
-            </w:r>
-          </w:p>
-        </w:tc>
-        <w:tc>
-          <w:tcPr>
-            <w:tcW w:type="dxa" w:w="6123"/>
-          </w:tcPr>
-          <w:p>
-            <w:pPr>
-              <w:spacing w:after="20" w:line="252" w:lineRule="auto"/>
-            </w:pPr>
-            <w:r>
-              <w:rPr>
-                <w:b w:val="0"/>
-                <w:sz w:val="18"/>
-              </w:rPr>
-              <w:t>Charts 4 to 6. Not location, the price-tag trade, priced per sq ft.</w:t>
-            </w:r>
-          </w:p>
-        </w:tc>
-      </w:tr>
-      <w:tr>
-        <w:tc>
-          <w:tcPr>
-            <w:tcW w:type="dxa" w:w="2381"/>
-          </w:tcPr>
-          <w:p>
-            <w:pPr>
-              <w:spacing w:after="20" w:line="252" w:lineRule="auto"/>
-            </w:pPr>
-            <w:r>
-              <w:rPr>
-                <w:b/>
-                <w:sz w:val="18"/>
-              </w:rPr>
-              <w:t>Row 3: why and what changed</w:t>
-            </w:r>
-          </w:p>
-        </w:tc>
-        <w:tc>
-          <w:tcPr>
-            <w:tcW w:type="dxa" w:w="907"/>
-          </w:tcPr>
-          <w:p>
-            <w:pPr>
-              <w:spacing w:after="20" w:line="252" w:lineRule="auto"/>
-            </w:pPr>
-            <w:r>
-              <w:rPr>
-                <w:b w:val="0"/>
-                <w:sz w:val="18"/>
-              </w:rPr>
-              <w:t>80 s</w:t>
-            </w:r>
-          </w:p>
-        </w:tc>
-        <w:tc>
-          <w:tcPr>
-            <w:tcW w:type="dxa" w:w="6123"/>
-          </w:tcPr>
-          <w:p>
-            <w:pPr>
-              <w:spacing w:after="20" w:line="252" w:lineRule="auto"/>
-            </w:pPr>
-            <w:r>
-              <w:rPr>
-                <w:b w:val="0"/>
-                <w:sz w:val="18"/>
-              </w:rPr>
-              <w:t>Charts 7 to 9. Affordability, borrowing limits, the price tag after the cap.</w:t>
-            </w:r>
-          </w:p>
-        </w:tc>
-      </w:tr>
-      <w:tr>
-        <w:tc>
-          <w:tcPr>
-            <w:tcW w:type="dxa" w:w="2381"/>
-          </w:tcPr>
-          <w:p>
-            <w:pPr>
-              <w:spacing w:after="20" w:line="252" w:lineRule="auto"/>
-            </w:pPr>
-            <w:r>
-              <w:rPr>
-                <w:b/>
-                <w:sz w:val="18"/>
-              </w:rPr>
-              <w:t>Answer</w:t>
-            </w:r>
-          </w:p>
-        </w:tc>
-        <w:tc>
-          <w:tcPr>
-            <w:tcW w:type="dxa" w:w="907"/>
-          </w:tcPr>
-          <w:p>
-            <w:pPr>
-              <w:spacing w:after="20" w:line="252" w:lineRule="auto"/>
-            </w:pPr>
-            <w:r>
-              <w:rPr>
-                <w:b w:val="0"/>
-                <w:sz w:val="18"/>
-              </w:rPr>
-              <w:t>40 s</w:t>
-            </w:r>
-          </w:p>
-        </w:tc>
-        <w:tc>
-          <w:tcPr>
-            <w:tcW w:type="dxa" w:w="6123"/>
-          </w:tcPr>
-          <w:p>
-            <w:pPr>
-              <w:spacing w:after="20" w:line="252" w:lineRule="auto"/>
-            </w:pPr>
-            <w:r>
-              <w:rPr>
-                <w:b w:val="0"/>
-                <w:sz w:val="18"/>
-              </w:rPr>
-              <w:t>The answer line, the three findings, what it means for buyers and policy.</w:t>
-            </w:r>
-          </w:p>
-        </w:tc>
-      </w:tr>
-    </w:tbl>
-    <w:p/>
-    <w:p>
-      <w:r>
-        <w:rPr>
-          <w:b w:val="0"/>
-        </w:rPr>
-        <w:t>Lines you can say, one per part:</w:t>
-      </w:r>
-    </w:p>
-    <w:p>
-      <w:pPr>
-        <w:pStyle w:val="ListBullet"/>
-      </w:pPr>
-      <w:r>
-        <w:rPr>
-          <w:b/>
-        </w:rPr>
-        <w:t>Open:</w:t>
-      </w:r>
-      <w:r>
-        <w:rPr>
-          <w:b w:val="0"/>
-        </w:rPr>
-        <w:t xml:space="preserve"> "Shrinkflation is less product for the same price tag. We asked whether Singapore's private homes did that, and whether it is still happening."</w:t>
-      </w:r>
-    </w:p>
-    <w:p>
-      <w:pPr>
-        <w:pStyle w:val="ListBullet"/>
-      </w:pPr>
-      <w:r>
-        <w:rPr>
-          <w:b/>
-        </w:rPr>
-        <w:t>Row 1:</w:t>
-      </w:r>
-      <w:r>
-        <w:rPr>
-          <w:b w:val="0"/>
-        </w:rPr>
-        <w:t xml:space="preserve"> "Today's new launches are 21% smaller than resale homes. The drop came with land sold after 2008, 43% in five years, and the big homes are what disappeared."</w:t>
-      </w:r>
-    </w:p>
-    <w:p>
-      <w:pPr>
-        <w:pStyle w:val="ListBullet"/>
-      </w:pPr>
-      <w:r>
-        <w:rPr>
-          <w:b/>
-        </w:rPr>
-        <w:t>Row 2:</w:t>
-      </w:r>
-      <w:r>
-        <w:rPr>
-          <w:b w:val="0"/>
-        </w:rPr>
-        <w:t xml:space="preserve"> "It is the same inside every district, so it is not location. And because launches are priced per square foot, a smaller home really does mean a lower price tag."</w:t>
-      </w:r>
-    </w:p>
-    <w:p>
-      <w:pPr>
-        <w:pStyle w:val="ListBullet"/>
-      </w:pPr>
-      <w:r>
-        <w:rPr>
-          <w:b/>
-        </w:rPr>
-        <w:t>Row 3:</w:t>
-      </w:r>
-      <w:r>
-        <w:rPr>
-          <w:b w:val="0"/>
-        </w:rPr>
-        <w:t xml:space="preserve"> "It happened when prices were furthest ahead of incomes. Then URA capped it, so now the price tag rises instead: plus 49% since 2020, at the edge of what a median household can borrow."</w:t>
-      </w:r>
-    </w:p>
-    <w:p>
-      <w:pPr>
-        <w:pStyle w:val="ListBullet"/>
-      </w:pPr>
-      <w:r>
-        <w:rPr>
-          <w:b/>
-        </w:rPr>
-        <w:t>Close:</w:t>
-      </w:r>
-      <w:r>
-        <w:rPr>
-          <w:b w:val="0"/>
-        </w:rPr>
-        <w:t xml:space="preserve"> "So yes, homes shrank to stay affordable, until the rules stopped it. For a buyer, compare price per square foot, not the price tag."</w:t>
-      </w:r>
-    </w:p>
-    <w:p>
-      <w:pPr>
-        <w:pStyle w:val="ListBullet"/>
-      </w:pPr>
-      <w:r>
-        <w:rPr>
-          <w:b w:val="0"/>
-        </w:rPr>
-        <w:t>Say each chart's bold takeaway first, then point at the part of the chart it comes from. Do not read the guide out loud.</w:t>
-      </w:r>
-    </w:p>
-    <w:p>
-      <w:pPr>
-        <w:pStyle w:val="Heading1"/>
-      </w:pPr>
-      <w:r>
-        <w:t>16. Sources</w:t>
+        <w:pStyle w:val="Heading2"/>
+      </w:pPr>
+      <w:r>
+        <w:t>Sources</w:t>
       </w:r>
     </w:p>
     <w:p>
@@ -6160,7 +7147,7 @@
       <w:b/>
       <w:bCs/>
       <w:color w:val="0D366B"/>
-      <w:sz w:val="30"/>
+      <w:sz w:val="32"/>
       <w:szCs w:val="28"/>
     </w:rPr>
   </w:style>
@@ -6184,7 +7171,7 @@
       <w:b/>
       <w:bCs/>
       <w:color w:val="0D366B"/>
-      <w:sz w:val="25"/>
+      <w:sz w:val="26"/>
       <w:szCs w:val="26"/>
     </w:rPr>
   </w:style>
@@ -6200,15 +7187,15 @@
     <w:pPr>
       <w:keepNext/>
       <w:keepLines/>
-      <w:spacing w:before="160" w:after="40"/>
+      <w:spacing w:before="200" w:after="0"/>
       <w:outlineLvl w:val="2"/>
     </w:pPr>
     <w:rPr>
       <w:rFonts w:ascii="Arial" w:hAnsi="Arial"/>
       <w:b/>
       <w:bCs/>
-      <w:color w:val="52514E"/>
-      <w:sz w:val="21"/>
+      <w:color w:val="0D366B"/>
+      <w:sz w:val="24"/>
     </w:rPr>
   </w:style>
   <w:style w:type="paragraph" w:styleId="Heading4">
@@ -6224,16 +7211,17 @@
     <w:pPr>
       <w:keepNext/>
       <w:keepLines/>
-      <w:spacing w:before="200" w:after="0"/>
+      <w:spacing w:before="160" w:after="40"/>
       <w:outlineLvl w:val="3"/>
     </w:pPr>
     <w:rPr>
-      <w:rFonts w:asciiTheme="majorHAnsi" w:eastAsiaTheme="majorEastAsia" w:hAnsiTheme="majorHAnsi" w:cstheme="majorBidi"/>
+      <w:rFonts w:ascii="Arial" w:hAnsi="Arial"/>
       <w:b/>
       <w:bCs/>
-      <w:i/>
+      <w:i w:val="0"/>
       <w:iCs/>
-      <w:color w:val="4F81BD" w:themeColor="accent1"/>
+      <w:color w:val="52514E"/>
+      <w:sz w:val="21"/>
     </w:rPr>
   </w:style>
   <w:style w:type="paragraph" w:styleId="Heading5">

</xml_diff>

<commit_message>
Make the interpretation version the only poster; Jialin replaces Linda
Each chart keeps its takeaway line above and a short comment below. The
version without comments, the --insights flag and the insights files are
removed; figs_insight/ is now figs_poster/. Zip and guide rebuilt to match.

Co-Authored-By: Claude Opus 5.5 <noreply@anthropic.com>
</commit_message>
<xml_diff>
--- a/shrinkflation_poster_guide.docx
+++ b/shrinkflation_poster_guide.docx
@@ -155,7 +155,7 @@
         <w:rPr>
           <w:b w:val="0"/>
         </w:rPr>
-        <w:t xml:space="preserve"> Martin, Huaitao, Manan, Linda, Midhvan and Hoyoung. Before submitting, check everyone's name is spelled the way they want it on the poster, export the PDF from PowerPoint and check it is one page.</w:t>
+        <w:t xml:space="preserve"> Martin, Huaitao, Manan, Jialin, Midhvan and Hoyoung. Before submitting, check everyone's name is spelled the way they want it on the poster, export the PDF from PowerPoint and check it is one page.</w:t>
       </w:r>
     </w:p>
     <w:p>
@@ -383,7 +383,7 @@
         <w:rPr>
           <w:b w:val="0"/>
         </w:rPr>
-        <w:t>Every chart has one bold line on top. That line is the single most important takeaway, with a number you can read off the chart. When you present, say that line first, then point to where it comes from on the chart.</w:t>
+        <w:t>Every chart has one bold line on top. That line is the single most important takeaway, with a number you can read off the chart. Under the chart sits a short grey comment on what it means, beyond what the chart shows on its own. When you present, say the bold line first, point to where it comes from on the chart, then give the comment.</w:t>
       </w:r>
     </w:p>
     <w:p>
@@ -3146,7 +3146,19 @@
         <w:rPr>
           <w:b w:val="0"/>
         </w:rPr>
-        <w:t xml:space="preserve"> the nine charts at poster size. Edit poster text in </w:t>
+        <w:t xml:space="preserve"> the nine charts as the notebook draws them and </w:t>
+      </w:r>
+      <w:r>
+        <w:rPr>
+          <w:b/>
+        </w:rPr>
+        <w:t>figs_poster/</w:t>
+      </w:r>
+      <w:r>
+        <w:rPr>
+          <w:b w:val="0"/>
+        </w:rPr>
+        <w:t xml:space="preserve"> the same charts drawn shorter for the poster. Edit poster text in </w:t>
       </w:r>
       <w:r>
         <w:rPr>
@@ -5598,7 +5610,7 @@
         <w:rPr>
           <w:b w:val="0"/>
         </w:rPr>
-        <w:t>One takeaway line per chart, with a number that can be read off the chart.</w:t>
+        <w:t>One takeaway line above each chart, with a number that can be read off the chart, and one short comment below it on what it means.</w:t>
       </w:r>
     </w:p>
     <w:p>

</xml_diff>

<commit_message>
Humanize the poster text
Finding 1 gives the 34% to 8% drop instead of 'all but disappeared';
finding 2 drops the 'It is not X. It works because' construction;
chart 6 comment folds its closer into the sentence; 'hinges on' and
'the size of the product' made plain; chart 5 takeaway in past tense.
PDF, pptx, guide and zip rebuilt.

Co-Authored-By: Claude Opus 5.5 <noreply@anthropic.com>
</commit_message>
<xml_diff>
--- a/shrinkflation_poster_guide.docx
+++ b/shrinkflation_poster_guide.docx
@@ -819,7 +819,7 @@
                 <w:b/>
                 <w:color w:val="C44E1E"/>
               </w:rPr>
-              <w:t>5. Shrinking cut prices to S$1.45M; after 2019 they jump to S$2.05M</w:t>
+              <w:t>5. Shrinking cut prices to S$1.45M; after 2019 they jumped to S$2.05M</w:t>
             </w:r>
           </w:p>
           <w:p>
@@ -4566,7 +4566,7 @@
           <w:color w:val="C44E1E"/>
           <w:sz w:val="22"/>
         </w:rPr>
-        <w:t>Shrinking cut prices to S$1.45M; after 2019 they jump to S$2.05M</w:t>
+        <w:t>Shrinking cut prices to S$1.45M; after 2019 they jumped to S$2.05M</w:t>
       </w:r>
     </w:p>
     <w:p>

</xml_diff>